<commit_message>
Final render fixes: mathtext-safe chart titles, no-split table rows, repeated headers, page-2 disclosure fit
38-page PDF audit clean: no mid-row table splits, no orphaned headings,
no blank pages, zero em-dashes, embargo-safe exhibits.

Co-Authored-By: Claude Fable 5 <noreply@anthropic.com>
Claude-Session: https://claude.ai/code/session_01TXNrMQSsp5SsvaYzynqJ6k
</commit_message>
<xml_diff>
--- a/output/Databricks_Initiation_Note_Jul2026.docx
+++ b/output/Databricks_Initiation_Note_Jul2026.docx
@@ -271,6 +271,7 @@
     </w:p>
     <w:p>
       <w:pPr>
+        <w:keepNext/>
         <w:spacing w:after="60"/>
         <w:jc w:val="left"/>
       </w:pPr>
@@ -312,6 +313,10 @@
         <w:gridCol w:w="2340"/>
       </w:tblGrid>
       <w:tr>
+        <w:trPr>
+          <w:cantSplit/>
+          <w:tblHeader w:val="true"/>
+        </w:trPr>
         <w:tc>
           <w:tcPr>
             <w:tcW w:type="dxa" w:w="2321"/>
@@ -406,6 +411,9 @@
         </w:tc>
       </w:tr>
       <w:tr>
+        <w:trPr>
+          <w:cantSplit/>
+        </w:trPr>
         <w:tc>
           <w:tcPr>
             <w:tcW w:type="dxa" w:w="2321"/>
@@ -496,6 +504,9 @@
         </w:tc>
       </w:tr>
       <w:tr>
+        <w:trPr>
+          <w:cantSplit/>
+        </w:trPr>
         <w:tc>
           <w:tcPr>
             <w:tcW w:type="dxa" w:w="2321"/>
@@ -590,6 +601,9 @@
         </w:tc>
       </w:tr>
       <w:tr>
+        <w:trPr>
+          <w:cantSplit/>
+        </w:trPr>
         <w:tc>
           <w:tcPr>
             <w:tcW w:type="dxa" w:w="2321"/>
@@ -680,6 +694,9 @@
         </w:tc>
       </w:tr>
       <w:tr>
+        <w:trPr>
+          <w:cantSplit/>
+        </w:trPr>
         <w:tc>
           <w:tcPr>
             <w:tcW w:type="dxa" w:w="2321"/>
@@ -774,6 +791,9 @@
         </w:tc>
       </w:tr>
       <w:tr>
+        <w:trPr>
+          <w:cantSplit/>
+        </w:trPr>
         <w:tc>
           <w:tcPr>
             <w:tcW w:type="dxa" w:w="2321"/>
@@ -864,6 +884,9 @@
         </w:tc>
       </w:tr>
       <w:tr>
+        <w:trPr>
+          <w:cantSplit/>
+        </w:trPr>
         <w:tc>
           <w:tcPr>
             <w:tcW w:type="dxa" w:w="2321"/>
@@ -958,6 +981,9 @@
         </w:tc>
       </w:tr>
       <w:tr>
+        <w:trPr>
+          <w:cantSplit/>
+        </w:trPr>
         <w:tc>
           <w:tcPr>
             <w:tcW w:type="dxa" w:w="2321"/>
@@ -1048,6 +1074,9 @@
         </w:tc>
       </w:tr>
       <w:tr>
+        <w:trPr>
+          <w:cantSplit/>
+        </w:trPr>
         <w:tc>
           <w:tcPr>
             <w:tcW w:type="dxa" w:w="2321"/>
@@ -1142,6 +1171,9 @@
         </w:tc>
       </w:tr>
       <w:tr>
+        <w:trPr>
+          <w:cantSplit/>
+        </w:trPr>
         <w:tc>
           <w:tcPr>
             <w:tcW w:type="dxa" w:w="2321"/>
@@ -1232,6 +1264,9 @@
         </w:tc>
       </w:tr>
       <w:tr>
+        <w:trPr>
+          <w:cantSplit/>
+        </w:trPr>
         <w:tc>
           <w:tcPr>
             <w:tcW w:type="dxa" w:w="2321"/>
@@ -1459,7 +1494,7 @@
           <w:color w:val="262B35"/>
           <w:sz w:val="21"/>
         </w:rPr>
-        <w:t>Every material figure in this note carries a dated source assigned to one of three tiers. T1 denotes audited or regulatory sources (SEC EDGAR filings, exchange data). T2 denotes company-announced figures (Databricks press releases, executive statements to named outlets). T3 denotes media or single-source reporting (The Information, aggregated coverage). Databricks is private and publishes no audited financials; the reader should hold in mind that even its T2 figures are self-reported and would be restated in an S-1 under GAAP discipline. Estimates are labeled as estimates. Figures that may be stale carry their as-of dates. Appendix B tables every load-bearing claim with its source, date, and tier.</w:t>
+        <w:t>Every material figure carries a dated source assigned to one of three tiers: T1, audited or regulatory (SEC EDGAR, exchange data); T2, company-announced (Databricks press releases, executive statements to named outlets); T3, media or single-source reporting. Databricks is private and publishes no audited financials; even its T2 figures are self-reported and would be restated in an S-1 under GAAP discipline. Estimates are labeled as estimates; figures that may be stale carry as-of dates. Appendix B tables every load-bearing claim with source, date, and tier.</w:t>
       </w:r>
     </w:p>
     <w:p>
@@ -1482,7 +1517,7 @@
           <w:color w:val="262B35"/>
           <w:sz w:val="21"/>
         </w:rPr>
-        <w:t>The correlation coefficient linking business quality to valuation across our coverage cohort is embargoed and appears nowhere in this document, in text or in chart form. The only cleared public expression of the quality-valuation relationship is the dollar-per-AIBQ-point spread, presented as a ranked bar (Figure 1). No chart in this note plots quality scores against valuations, and no chart carries a fitted line from which the embargoed statistic could be reconstructed.</w:t>
+        <w:t>The correlation coefficient linking business quality to valuation across our coverage cohort is embargoed and appears nowhere in this document, in text or in chart form. The only cleared public expression of the quality-valuation relationship is the dollar-per-AIBQ-point spread, presented as a ranked bar (Figure 1). No chart plots quality scores against valuations, and none carries a fitted line from which the embargoed statistic could be reconstructed.</w:t>
       </w:r>
     </w:p>
     <w:p>
@@ -1505,22 +1540,7 @@
           <w:color w:val="262B35"/>
           <w:sz w:val="21"/>
         </w:rPr>
-        <w:t>The base-case valuation anchors on the last completed financing mark of $134 billion (Series L, first close announced December 2025, additional close February 9, 2026; T2, company press releases and PitchBook deal record 313367-68T). The reported financing discussions at $165 to 175 billion (T3: The Information, June 9, 2026) remained unclosed as of July 10, 2026 and are excluded from the base case under our do-not-adopt rule for unclosed or rumored financings. They are analyzed, at length, in Section 10. Capital-efficiency calculations use an equity-only denominator; debt is excluded from that ratio by methodological ruling and informs the compute-independence and risk assessments instead (Appendix A).</w:t>
-      </w:r>
-    </w:p>
-    <w:p>
-      <w:pPr>
-        <w:spacing w:after="140"/>
-        <w:jc w:val="both"/>
-      </w:pPr>
-      <w:r>
-        <w:rPr>
-          <w:b w:val="0"/>
-          <w:i w:val="0"/>
-          <w:color w:val="262B35"/>
-          <w:sz w:val="21"/>
-        </w:rPr>
-        <w:t>This document is research, not investment advice. Databricks securities are not publicly traded; private-market access is restricted, illiquid, and unsuitable for investors who cannot bear total loss and indefinite holding periods. Figures for private peers are negotiated marks, not market prices.</w:t>
+        <w:t>The base-case valuation anchors on the last completed financing mark of $134 billion (Series L, first close announced December 2025, additional close February 9, 2026; T2). The reported financing discussions at $165 to 175 billion (T3: The Information, June 9, 2026) remained unclosed as of July 10, 2026 and are excluded from the base case under our do-not-adopt rule; they are analyzed in Section 10. Capital-efficiency calculations use an equity-only denominator by methodological ruling; debt informs the compute-independence and risk assessments instead (Appendix A). This is research, not investment advice: Databricks securities are unlisted and illiquid, and private-peer figures are negotiated marks, not market prices.</w:t>
       </w:r>
     </w:p>
     <w:p>
@@ -1802,6 +1822,7 @@
     </w:p>
     <w:p>
       <w:pPr>
+        <w:keepNext/>
         <w:spacing w:after="60"/>
         <w:jc w:val="left"/>
       </w:pPr>
@@ -1843,6 +1864,10 @@
         <w:gridCol w:w="2340"/>
       </w:tblGrid>
       <w:tr>
+        <w:trPr>
+          <w:cantSplit/>
+          <w:tblHeader w:val="true"/>
+        </w:trPr>
         <w:tc>
           <w:tcPr>
             <w:tcW w:type="dxa" w:w="5254"/>
@@ -1937,6 +1962,9 @@
         </w:tc>
       </w:tr>
       <w:tr>
+        <w:trPr>
+          <w:cantSplit/>
+        </w:trPr>
         <w:tc>
           <w:tcPr>
             <w:tcW w:type="dxa" w:w="5254"/>
@@ -2027,6 +2055,9 @@
         </w:tc>
       </w:tr>
       <w:tr>
+        <w:trPr>
+          <w:cantSplit/>
+        </w:trPr>
         <w:tc>
           <w:tcPr>
             <w:tcW w:type="dxa" w:w="5254"/>
@@ -2121,6 +2152,9 @@
         </w:tc>
       </w:tr>
       <w:tr>
+        <w:trPr>
+          <w:cantSplit/>
+        </w:trPr>
         <w:tc>
           <w:tcPr>
             <w:tcW w:type="dxa" w:w="5254"/>
@@ -2211,6 +2245,9 @@
         </w:tc>
       </w:tr>
       <w:tr>
+        <w:trPr>
+          <w:cantSplit/>
+        </w:trPr>
         <w:tc>
           <w:tcPr>
             <w:tcW w:type="dxa" w:w="5254"/>
@@ -2305,6 +2342,9 @@
         </w:tc>
       </w:tr>
       <w:tr>
+        <w:trPr>
+          <w:cantSplit/>
+        </w:trPr>
         <w:tc>
           <w:tcPr>
             <w:tcW w:type="dxa" w:w="5254"/>
@@ -2395,6 +2435,9 @@
         </w:tc>
       </w:tr>
       <w:tr>
+        <w:trPr>
+          <w:cantSplit/>
+        </w:trPr>
         <w:tc>
           <w:tcPr>
             <w:tcW w:type="dxa" w:w="5254"/>
@@ -2488,6 +2531,9 @@
         </w:tc>
       </w:tr>
       <w:tr>
+        <w:trPr>
+          <w:cantSplit/>
+        </w:trPr>
         <w:tc>
           <w:tcPr>
             <w:tcW w:type="dxa" w:w="5254"/>
@@ -2576,6 +2622,9 @@
         </w:tc>
       </w:tr>
       <w:tr>
+        <w:trPr>
+          <w:cantSplit/>
+        </w:trPr>
         <w:tc>
           <w:tcPr>
             <w:tcW w:type="dxa" w:w="5254"/>
@@ -2708,6 +2757,7 @@
     </w:p>
     <w:p>
       <w:pPr>
+        <w:keepNext/>
         <w:spacing w:after="60"/>
         <w:jc w:val="left"/>
       </w:pPr>
@@ -2748,6 +2798,10 @@
         <w:gridCol w:w="3120"/>
       </w:tblGrid>
       <w:tr>
+        <w:trPr>
+          <w:cantSplit/>
+          <w:tblHeader w:val="true"/>
+        </w:trPr>
         <w:tc>
           <w:tcPr>
             <w:tcW w:type="dxa" w:w="2645"/>
@@ -2819,6 +2873,9 @@
         </w:tc>
       </w:tr>
       <w:tr>
+        <w:trPr>
+          <w:cantSplit/>
+        </w:trPr>
         <w:tc>
           <w:tcPr>
             <w:tcW w:type="dxa" w:w="2645"/>
@@ -2887,6 +2944,9 @@
         </w:tc>
       </w:tr>
       <w:tr>
+        <w:trPr>
+          <w:cantSplit/>
+        </w:trPr>
         <w:tc>
           <w:tcPr>
             <w:tcW w:type="dxa" w:w="2645"/>
@@ -2958,6 +3018,9 @@
         </w:tc>
       </w:tr>
       <w:tr>
+        <w:trPr>
+          <w:cantSplit/>
+        </w:trPr>
         <w:tc>
           <w:tcPr>
             <w:tcW w:type="dxa" w:w="2645"/>
@@ -3026,6 +3089,9 @@
         </w:tc>
       </w:tr>
       <w:tr>
+        <w:trPr>
+          <w:cantSplit/>
+        </w:trPr>
         <w:tc>
           <w:tcPr>
             <w:tcW w:type="dxa" w:w="2645"/>
@@ -3097,6 +3163,9 @@
         </w:tc>
       </w:tr>
       <w:tr>
+        <w:trPr>
+          <w:cantSplit/>
+        </w:trPr>
         <w:tc>
           <w:tcPr>
             <w:tcW w:type="dxa" w:w="2645"/>
@@ -3205,6 +3274,7 @@
     </w:p>
     <w:p>
       <w:pPr>
+        <w:keepNext/>
         <w:spacing w:after="60"/>
         <w:jc w:val="left"/>
       </w:pPr>
@@ -3245,6 +3315,10 @@
         <w:gridCol w:w="3120"/>
       </w:tblGrid>
       <w:tr>
+        <w:trPr>
+          <w:cantSplit/>
+          <w:tblHeader w:val="true"/>
+        </w:trPr>
         <w:tc>
           <w:tcPr>
             <w:tcW w:type="dxa" w:w="3056"/>
@@ -3316,6 +3390,9 @@
         </w:tc>
       </w:tr>
       <w:tr>
+        <w:trPr>
+          <w:cantSplit/>
+        </w:trPr>
         <w:tc>
           <w:tcPr>
             <w:tcW w:type="dxa" w:w="3056"/>
@@ -3384,6 +3461,9 @@
         </w:tc>
       </w:tr>
       <w:tr>
+        <w:trPr>
+          <w:cantSplit/>
+        </w:trPr>
         <w:tc>
           <w:tcPr>
             <w:tcW w:type="dxa" w:w="3056"/>
@@ -3455,6 +3535,9 @@
         </w:tc>
       </w:tr>
       <w:tr>
+        <w:trPr>
+          <w:cantSplit/>
+        </w:trPr>
         <w:tc>
           <w:tcPr>
             <w:tcW w:type="dxa" w:w="3056"/>
@@ -3523,6 +3606,9 @@
         </w:tc>
       </w:tr>
       <w:tr>
+        <w:trPr>
+          <w:cantSplit/>
+        </w:trPr>
         <w:tc>
           <w:tcPr>
             <w:tcW w:type="dxa" w:w="3056"/>
@@ -3594,6 +3680,9 @@
         </w:tc>
       </w:tr>
       <w:tr>
+        <w:trPr>
+          <w:cantSplit/>
+        </w:trPr>
         <w:tc>
           <w:tcPr>
             <w:tcW w:type="dxa" w:w="3056"/>
@@ -3702,6 +3791,7 @@
     </w:p>
     <w:p>
       <w:pPr>
+        <w:keepNext/>
         <w:spacing w:after="60"/>
         <w:jc w:val="left"/>
       </w:pPr>
@@ -3742,6 +3832,10 @@
         <w:gridCol w:w="3120"/>
       </w:tblGrid>
       <w:tr>
+        <w:trPr>
+          <w:cantSplit/>
+          <w:tblHeader w:val="true"/>
+        </w:trPr>
         <w:tc>
           <w:tcPr>
             <w:tcW w:type="dxa" w:w="3362"/>
@@ -3813,6 +3907,9 @@
         </w:tc>
       </w:tr>
       <w:tr>
+        <w:trPr>
+          <w:cantSplit/>
+        </w:trPr>
         <w:tc>
           <w:tcPr>
             <w:tcW w:type="dxa" w:w="3362"/>
@@ -3881,6 +3978,9 @@
         </w:tc>
       </w:tr>
       <w:tr>
+        <w:trPr>
+          <w:cantSplit/>
+        </w:trPr>
         <w:tc>
           <w:tcPr>
             <w:tcW w:type="dxa" w:w="3362"/>
@@ -3952,6 +4052,9 @@
         </w:tc>
       </w:tr>
       <w:tr>
+        <w:trPr>
+          <w:cantSplit/>
+        </w:trPr>
         <w:tc>
           <w:tcPr>
             <w:tcW w:type="dxa" w:w="3362"/>
@@ -4020,6 +4123,9 @@
         </w:tc>
       </w:tr>
       <w:tr>
+        <w:trPr>
+          <w:cantSplit/>
+        </w:trPr>
         <w:tc>
           <w:tcPr>
             <w:tcW w:type="dxa" w:w="3362"/>
@@ -4131,6 +4237,7 @@
     </w:p>
     <w:p>
       <w:pPr>
+        <w:keepNext/>
         <w:spacing w:after="60"/>
         <w:jc w:val="left"/>
       </w:pPr>
@@ -4171,6 +4278,10 @@
         <w:gridCol w:w="3120"/>
       </w:tblGrid>
       <w:tr>
+        <w:trPr>
+          <w:cantSplit/>
+          <w:tblHeader w:val="true"/>
+        </w:trPr>
         <w:tc>
           <w:tcPr>
             <w:tcW w:type="dxa" w:w="2857"/>
@@ -4242,6 +4353,9 @@
         </w:tc>
       </w:tr>
       <w:tr>
+        <w:trPr>
+          <w:cantSplit/>
+        </w:trPr>
         <w:tc>
           <w:tcPr>
             <w:tcW w:type="dxa" w:w="2857"/>
@@ -4310,6 +4424,9 @@
         </w:tc>
       </w:tr>
       <w:tr>
+        <w:trPr>
+          <w:cantSplit/>
+        </w:trPr>
         <w:tc>
           <w:tcPr>
             <w:tcW w:type="dxa" w:w="2857"/>
@@ -4381,6 +4498,9 @@
         </w:tc>
       </w:tr>
       <w:tr>
+        <w:trPr>
+          <w:cantSplit/>
+        </w:trPr>
         <w:tc>
           <w:tcPr>
             <w:tcW w:type="dxa" w:w="2857"/>
@@ -4449,6 +4569,9 @@
         </w:tc>
       </w:tr>
       <w:tr>
+        <w:trPr>
+          <w:cantSplit/>
+        </w:trPr>
         <w:tc>
           <w:tcPr>
             <w:tcW w:type="dxa" w:w="2857"/>
@@ -4520,6 +4643,9 @@
         </w:tc>
       </w:tr>
       <w:tr>
+        <w:trPr>
+          <w:cantSplit/>
+        </w:trPr>
         <w:tc>
           <w:tcPr>
             <w:tcW w:type="dxa" w:w="2857"/>
@@ -4628,6 +4754,7 @@
     </w:p>
     <w:p>
       <w:pPr>
+        <w:keepNext/>
         <w:spacing w:after="60"/>
         <w:jc w:val="left"/>
       </w:pPr>
@@ -4668,6 +4795,10 @@
         <w:gridCol w:w="3120"/>
       </w:tblGrid>
       <w:tr>
+        <w:trPr>
+          <w:cantSplit/>
+          <w:tblHeader w:val="true"/>
+        </w:trPr>
         <w:tc>
           <w:tcPr>
             <w:tcW w:type="dxa" w:w="3056"/>
@@ -4739,6 +4870,9 @@
         </w:tc>
       </w:tr>
       <w:tr>
+        <w:trPr>
+          <w:cantSplit/>
+        </w:trPr>
         <w:tc>
           <w:tcPr>
             <w:tcW w:type="dxa" w:w="3056"/>
@@ -4807,6 +4941,9 @@
         </w:tc>
       </w:tr>
       <w:tr>
+        <w:trPr>
+          <w:cantSplit/>
+        </w:trPr>
         <w:tc>
           <w:tcPr>
             <w:tcW w:type="dxa" w:w="3056"/>
@@ -4878,6 +5015,9 @@
         </w:tc>
       </w:tr>
       <w:tr>
+        <w:trPr>
+          <w:cantSplit/>
+        </w:trPr>
         <w:tc>
           <w:tcPr>
             <w:tcW w:type="dxa" w:w="3056"/>
@@ -4946,6 +5086,9 @@
         </w:tc>
       </w:tr>
       <w:tr>
+        <w:trPr>
+          <w:cantSplit/>
+        </w:trPr>
         <w:tc>
           <w:tcPr>
             <w:tcW w:type="dxa" w:w="3056"/>
@@ -5017,6 +5160,9 @@
         </w:tc>
       </w:tr>
       <w:tr>
+        <w:trPr>
+          <w:cantSplit/>
+        </w:trPr>
         <w:tc>
           <w:tcPr>
             <w:tcW w:type="dxa" w:w="3056"/>
@@ -5272,6 +5418,7 @@
     </w:p>
     <w:p>
       <w:pPr>
+        <w:keepNext/>
         <w:spacing w:after="60"/>
         <w:jc w:val="left"/>
       </w:pPr>
@@ -5312,6 +5459,10 @@
         <w:gridCol w:w="3120"/>
       </w:tblGrid>
       <w:tr>
+        <w:trPr>
+          <w:cantSplit/>
+          <w:tblHeader w:val="true"/>
+        </w:trPr>
         <w:tc>
           <w:tcPr>
             <w:tcW w:type="dxa" w:w="1505"/>
@@ -5383,6 +5534,9 @@
         </w:tc>
       </w:tr>
       <w:tr>
+        <w:trPr>
+          <w:cantSplit/>
+        </w:trPr>
         <w:tc>
           <w:tcPr>
             <w:tcW w:type="dxa" w:w="1505"/>
@@ -5451,6 +5605,9 @@
         </w:tc>
       </w:tr>
       <w:tr>
+        <w:trPr>
+          <w:cantSplit/>
+        </w:trPr>
         <w:tc>
           <w:tcPr>
             <w:tcW w:type="dxa" w:w="1505"/>
@@ -5522,6 +5679,9 @@
         </w:tc>
       </w:tr>
       <w:tr>
+        <w:trPr>
+          <w:cantSplit/>
+        </w:trPr>
         <w:tc>
           <w:tcPr>
             <w:tcW w:type="dxa" w:w="1505"/>
@@ -5590,6 +5750,9 @@
         </w:tc>
       </w:tr>
       <w:tr>
+        <w:trPr>
+          <w:cantSplit/>
+        </w:trPr>
         <w:tc>
           <w:tcPr>
             <w:tcW w:type="dxa" w:w="1505"/>
@@ -5661,6 +5824,9 @@
         </w:tc>
       </w:tr>
       <w:tr>
+        <w:trPr>
+          <w:cantSplit/>
+        </w:trPr>
         <w:tc>
           <w:tcPr>
             <w:tcW w:type="dxa" w:w="1505"/>
@@ -6097,6 +6263,7 @@
     </w:p>
     <w:p>
       <w:pPr>
+        <w:keepNext/>
         <w:spacing w:after="60"/>
         <w:jc w:val="left"/>
       </w:pPr>
@@ -6137,6 +6304,10 @@
         <w:gridCol w:w="3120"/>
       </w:tblGrid>
       <w:tr>
+        <w:trPr>
+          <w:cantSplit/>
+          <w:tblHeader w:val="true"/>
+        </w:trPr>
         <w:tc>
           <w:tcPr>
             <w:tcW w:type="dxa" w:w="2290"/>
@@ -6208,6 +6379,9 @@
         </w:tc>
       </w:tr>
       <w:tr>
+        <w:trPr>
+          <w:cantSplit/>
+        </w:trPr>
         <w:tc>
           <w:tcPr>
             <w:tcW w:type="dxa" w:w="2290"/>
@@ -6276,6 +6450,9 @@
         </w:tc>
       </w:tr>
       <w:tr>
+        <w:trPr>
+          <w:cantSplit/>
+        </w:trPr>
         <w:tc>
           <w:tcPr>
             <w:tcW w:type="dxa" w:w="2290"/>
@@ -6347,6 +6524,9 @@
         </w:tc>
       </w:tr>
       <w:tr>
+        <w:trPr>
+          <w:cantSplit/>
+        </w:trPr>
         <w:tc>
           <w:tcPr>
             <w:tcW w:type="dxa" w:w="2290"/>
@@ -6415,6 +6595,9 @@
         </w:tc>
       </w:tr>
       <w:tr>
+        <w:trPr>
+          <w:cantSplit/>
+        </w:trPr>
         <w:tc>
           <w:tcPr>
             <w:tcW w:type="dxa" w:w="2290"/>
@@ -6486,6 +6669,9 @@
         </w:tc>
       </w:tr>
       <w:tr>
+        <w:trPr>
+          <w:cantSplit/>
+        </w:trPr>
         <w:tc>
           <w:tcPr>
             <w:tcW w:type="dxa" w:w="2290"/>
@@ -6554,6 +6740,9 @@
         </w:tc>
       </w:tr>
       <w:tr>
+        <w:trPr>
+          <w:cantSplit/>
+        </w:trPr>
         <w:tc>
           <w:tcPr>
             <w:tcW w:type="dxa" w:w="2290"/>
@@ -6680,6 +6869,7 @@
     </w:p>
     <w:p>
       <w:pPr>
+        <w:keepNext/>
         <w:spacing w:after="60"/>
         <w:jc w:val="left"/>
       </w:pPr>
@@ -6721,6 +6911,10 @@
         <w:gridCol w:w="2340"/>
       </w:tblGrid>
       <w:tr>
+        <w:trPr>
+          <w:cantSplit/>
+          <w:tblHeader w:val="true"/>
+        </w:trPr>
         <w:tc>
           <w:tcPr>
             <w:tcW w:type="dxa" w:w="788"/>
@@ -6815,6 +7009,9 @@
         </w:tc>
       </w:tr>
       <w:tr>
+        <w:trPr>
+          <w:cantSplit/>
+        </w:trPr>
         <w:tc>
           <w:tcPr>
             <w:tcW w:type="dxa" w:w="788"/>
@@ -6905,6 +7102,9 @@
         </w:tc>
       </w:tr>
       <w:tr>
+        <w:trPr>
+          <w:cantSplit/>
+        </w:trPr>
         <w:tc>
           <w:tcPr>
             <w:tcW w:type="dxa" w:w="788"/>
@@ -6999,6 +7199,9 @@
         </w:tc>
       </w:tr>
       <w:tr>
+        <w:trPr>
+          <w:cantSplit/>
+        </w:trPr>
         <w:tc>
           <w:tcPr>
             <w:tcW w:type="dxa" w:w="788"/>
@@ -7089,6 +7292,9 @@
         </w:tc>
       </w:tr>
       <w:tr>
+        <w:trPr>
+          <w:cantSplit/>
+        </w:trPr>
         <w:tc>
           <w:tcPr>
             <w:tcW w:type="dxa" w:w="788"/>
@@ -7183,6 +7389,9 @@
         </w:tc>
       </w:tr>
       <w:tr>
+        <w:trPr>
+          <w:cantSplit/>
+        </w:trPr>
         <w:tc>
           <w:tcPr>
             <w:tcW w:type="dxa" w:w="788"/>
@@ -7273,6 +7482,9 @@
         </w:tc>
       </w:tr>
       <w:tr>
+        <w:trPr>
+          <w:cantSplit/>
+        </w:trPr>
         <w:tc>
           <w:tcPr>
             <w:tcW w:type="dxa" w:w="788"/>
@@ -7367,6 +7579,9 @@
         </w:tc>
       </w:tr>
       <w:tr>
+        <w:trPr>
+          <w:cantSplit/>
+        </w:trPr>
         <w:tc>
           <w:tcPr>
             <w:tcW w:type="dxa" w:w="788"/>
@@ -7457,6 +7672,9 @@
         </w:tc>
       </w:tr>
       <w:tr>
+        <w:trPr>
+          <w:cantSplit/>
+        </w:trPr>
         <w:tc>
           <w:tcPr>
             <w:tcW w:type="dxa" w:w="788"/>
@@ -7551,6 +7769,9 @@
         </w:tc>
       </w:tr>
       <w:tr>
+        <w:trPr>
+          <w:cantSplit/>
+        </w:trPr>
         <w:tc>
           <w:tcPr>
             <w:tcW w:type="dxa" w:w="788"/>
@@ -7641,6 +7862,9 @@
         </w:tc>
       </w:tr>
       <w:tr>
+        <w:trPr>
+          <w:cantSplit/>
+        </w:trPr>
         <w:tc>
           <w:tcPr>
             <w:tcW w:type="dxa" w:w="788"/>
@@ -7735,6 +7959,9 @@
         </w:tc>
       </w:tr>
       <w:tr>
+        <w:trPr>
+          <w:cantSplit/>
+        </w:trPr>
         <w:tc>
           <w:tcPr>
             <w:tcW w:type="dxa" w:w="788"/>
@@ -7825,6 +8052,9 @@
         </w:tc>
       </w:tr>
       <w:tr>
+        <w:trPr>
+          <w:cantSplit/>
+        </w:trPr>
         <w:tc>
           <w:tcPr>
             <w:tcW w:type="dxa" w:w="788"/>
@@ -7919,6 +8149,9 @@
         </w:tc>
       </w:tr>
       <w:tr>
+        <w:trPr>
+          <w:cantSplit/>
+        </w:trPr>
         <w:tc>
           <w:tcPr>
             <w:tcW w:type="dxa" w:w="788"/>
@@ -8009,6 +8242,9 @@
         </w:tc>
       </w:tr>
       <w:tr>
+        <w:trPr>
+          <w:cantSplit/>
+        </w:trPr>
         <w:tc>
           <w:tcPr>
             <w:tcW w:type="dxa" w:w="788"/>
@@ -8103,6 +8339,9 @@
         </w:tc>
       </w:tr>
       <w:tr>
+        <w:trPr>
+          <w:cantSplit/>
+        </w:trPr>
         <w:tc>
           <w:tcPr>
             <w:tcW w:type="dxa" w:w="788"/>
@@ -8193,6 +8432,9 @@
         </w:tc>
       </w:tr>
       <w:tr>
+        <w:trPr>
+          <w:cantSplit/>
+        </w:trPr>
         <w:tc>
           <w:tcPr>
             <w:tcW w:type="dxa" w:w="788"/>
@@ -8776,6 +9018,7 @@
     </w:p>
     <w:p>
       <w:pPr>
+        <w:keepNext/>
         <w:spacing w:after="60"/>
         <w:jc w:val="left"/>
       </w:pPr>
@@ -8818,6 +9061,10 @@
         <w:gridCol w:w="1872"/>
       </w:tblGrid>
       <w:tr>
+        <w:trPr>
+          <w:cantSplit/>
+          <w:tblHeader w:val="true"/>
+        </w:trPr>
         <w:tc>
           <w:tcPr>
             <w:tcW w:type="dxa" w:w="700"/>
@@ -8935,6 +9182,9 @@
         </w:tc>
       </w:tr>
       <w:tr>
+        <w:trPr>
+          <w:cantSplit/>
+        </w:trPr>
         <w:tc>
           <w:tcPr>
             <w:tcW w:type="dxa" w:w="700"/>
@@ -9047,6 +9297,9 @@
         </w:tc>
       </w:tr>
       <w:tr>
+        <w:trPr>
+          <w:cantSplit/>
+        </w:trPr>
         <w:tc>
           <w:tcPr>
             <w:tcW w:type="dxa" w:w="700"/>
@@ -9164,6 +9417,9 @@
         </w:tc>
       </w:tr>
       <w:tr>
+        <w:trPr>
+          <w:cantSplit/>
+        </w:trPr>
         <w:tc>
           <w:tcPr>
             <w:tcW w:type="dxa" w:w="700"/>
@@ -9443,6 +9699,7 @@
     </w:p>
     <w:p>
       <w:pPr>
+        <w:keepNext/>
         <w:spacing w:after="60"/>
         <w:jc w:val="left"/>
       </w:pPr>
@@ -9484,6 +9741,10 @@
         <w:gridCol w:w="2340"/>
       </w:tblGrid>
       <w:tr>
+        <w:trPr>
+          <w:cantSplit/>
+          <w:tblHeader w:val="true"/>
+        </w:trPr>
         <w:tc>
           <w:tcPr>
             <w:tcW w:type="dxa" w:w="700"/>
@@ -9578,6 +9839,9 @@
         </w:tc>
       </w:tr>
       <w:tr>
+        <w:trPr>
+          <w:cantSplit/>
+        </w:trPr>
         <w:tc>
           <w:tcPr>
             <w:tcW w:type="dxa" w:w="700"/>
@@ -9668,6 +9932,9 @@
         </w:tc>
       </w:tr>
       <w:tr>
+        <w:trPr>
+          <w:cantSplit/>
+        </w:trPr>
         <w:tc>
           <w:tcPr>
             <w:tcW w:type="dxa" w:w="700"/>
@@ -9762,6 +10029,9 @@
         </w:tc>
       </w:tr>
       <w:tr>
+        <w:trPr>
+          <w:cantSplit/>
+        </w:trPr>
         <w:tc>
           <w:tcPr>
             <w:tcW w:type="dxa" w:w="700"/>
@@ -9852,6 +10122,9 @@
         </w:tc>
       </w:tr>
       <w:tr>
+        <w:trPr>
+          <w:cantSplit/>
+        </w:trPr>
         <w:tc>
           <w:tcPr>
             <w:tcW w:type="dxa" w:w="700"/>
@@ -9946,6 +10219,9 @@
         </w:tc>
       </w:tr>
       <w:tr>
+        <w:trPr>
+          <w:cantSplit/>
+        </w:trPr>
         <w:tc>
           <w:tcPr>
             <w:tcW w:type="dxa" w:w="700"/>
@@ -10036,6 +10312,9 @@
         </w:tc>
       </w:tr>
       <w:tr>
+        <w:trPr>
+          <w:cantSplit/>
+        </w:trPr>
         <w:tc>
           <w:tcPr>
             <w:tcW w:type="dxa" w:w="700"/>
@@ -10130,6 +10409,9 @@
         </w:tc>
       </w:tr>
       <w:tr>
+        <w:trPr>
+          <w:cantSplit/>
+        </w:trPr>
         <w:tc>
           <w:tcPr>
             <w:tcW w:type="dxa" w:w="700"/>
@@ -10422,6 +10704,7 @@
     </w:p>
     <w:p>
       <w:pPr>
+        <w:keepNext/>
         <w:spacing w:after="60"/>
         <w:jc w:val="left"/>
       </w:pPr>
@@ -10462,6 +10745,10 @@
         <w:gridCol w:w="3120"/>
       </w:tblGrid>
       <w:tr>
+        <w:trPr>
+          <w:cantSplit/>
+          <w:tblHeader w:val="true"/>
+        </w:trPr>
         <w:tc>
           <w:tcPr>
             <w:tcW w:type="dxa" w:w="2717"/>
@@ -10533,6 +10820,9 @@
         </w:tc>
       </w:tr>
       <w:tr>
+        <w:trPr>
+          <w:cantSplit/>
+        </w:trPr>
         <w:tc>
           <w:tcPr>
             <w:tcW w:type="dxa" w:w="2717"/>
@@ -10601,6 +10891,9 @@
         </w:tc>
       </w:tr>
       <w:tr>
+        <w:trPr>
+          <w:cantSplit/>
+        </w:trPr>
         <w:tc>
           <w:tcPr>
             <w:tcW w:type="dxa" w:w="2717"/>
@@ -10672,6 +10965,9 @@
         </w:tc>
       </w:tr>
       <w:tr>
+        <w:trPr>
+          <w:cantSplit/>
+        </w:trPr>
         <w:tc>
           <w:tcPr>
             <w:tcW w:type="dxa" w:w="2717"/>
@@ -10740,6 +11036,9 @@
         </w:tc>
       </w:tr>
       <w:tr>
+        <w:trPr>
+          <w:cantSplit/>
+        </w:trPr>
         <w:tc>
           <w:tcPr>
             <w:tcW w:type="dxa" w:w="2717"/>
@@ -10811,6 +11110,9 @@
         </w:tc>
       </w:tr>
       <w:tr>
+        <w:trPr>
+          <w:cantSplit/>
+        </w:trPr>
         <w:tc>
           <w:tcPr>
             <w:tcW w:type="dxa" w:w="2717"/>
@@ -10927,6 +11229,7 @@
     </w:p>
     <w:p>
       <w:pPr>
+        <w:keepNext/>
         <w:spacing w:after="60"/>
         <w:jc w:val="left"/>
       </w:pPr>
@@ -10967,6 +11270,10 @@
         <w:gridCol w:w="3120"/>
       </w:tblGrid>
       <w:tr>
+        <w:trPr>
+          <w:cantSplit/>
+          <w:tblHeader w:val="true"/>
+        </w:trPr>
         <w:tc>
           <w:tcPr>
             <w:tcW w:type="dxa" w:w="1701"/>
@@ -11038,6 +11345,9 @@
         </w:tc>
       </w:tr>
       <w:tr>
+        <w:trPr>
+          <w:cantSplit/>
+        </w:trPr>
         <w:tc>
           <w:tcPr>
             <w:tcW w:type="dxa" w:w="1701"/>
@@ -11106,6 +11416,9 @@
         </w:tc>
       </w:tr>
       <w:tr>
+        <w:trPr>
+          <w:cantSplit/>
+        </w:trPr>
         <w:tc>
           <w:tcPr>
             <w:tcW w:type="dxa" w:w="1701"/>
@@ -11177,6 +11490,9 @@
         </w:tc>
       </w:tr>
       <w:tr>
+        <w:trPr>
+          <w:cantSplit/>
+        </w:trPr>
         <w:tc>
           <w:tcPr>
             <w:tcW w:type="dxa" w:w="1701"/>
@@ -11245,6 +11561,9 @@
         </w:tc>
       </w:tr>
       <w:tr>
+        <w:trPr>
+          <w:cantSplit/>
+        </w:trPr>
         <w:tc>
           <w:tcPr>
             <w:tcW w:type="dxa" w:w="1701"/>
@@ -11402,6 +11721,7 @@
     </w:p>
     <w:p>
       <w:pPr>
+        <w:keepNext/>
         <w:spacing w:after="60"/>
         <w:jc w:val="left"/>
       </w:pPr>
@@ -11443,6 +11763,10 @@
         <w:gridCol w:w="2340"/>
       </w:tblGrid>
       <w:tr>
+        <w:trPr>
+          <w:cantSplit/>
+          <w:tblHeader w:val="true"/>
+        </w:trPr>
         <w:tc>
           <w:tcPr>
             <w:tcW w:type="dxa" w:w="1509"/>
@@ -11537,6 +11861,9 @@
         </w:tc>
       </w:tr>
       <w:tr>
+        <w:trPr>
+          <w:cantSplit/>
+        </w:trPr>
         <w:tc>
           <w:tcPr>
             <w:tcW w:type="dxa" w:w="1509"/>
@@ -11627,6 +11954,9 @@
         </w:tc>
       </w:tr>
       <w:tr>
+        <w:trPr>
+          <w:cantSplit/>
+        </w:trPr>
         <w:tc>
           <w:tcPr>
             <w:tcW w:type="dxa" w:w="1509"/>
@@ -11721,6 +12051,9 @@
         </w:tc>
       </w:tr>
       <w:tr>
+        <w:trPr>
+          <w:cantSplit/>
+        </w:trPr>
         <w:tc>
           <w:tcPr>
             <w:tcW w:type="dxa" w:w="1509"/>
@@ -11811,6 +12144,9 @@
         </w:tc>
       </w:tr>
       <w:tr>
+        <w:trPr>
+          <w:cantSplit/>
+        </w:trPr>
         <w:tc>
           <w:tcPr>
             <w:tcW w:type="dxa" w:w="1509"/>
@@ -11905,6 +12241,9 @@
         </w:tc>
       </w:tr>
       <w:tr>
+        <w:trPr>
+          <w:cantSplit/>
+        </w:trPr>
         <w:tc>
           <w:tcPr>
             <w:tcW w:type="dxa" w:w="1509"/>
@@ -11995,6 +12334,9 @@
         </w:tc>
       </w:tr>
       <w:tr>
+        <w:trPr>
+          <w:cantSplit/>
+        </w:trPr>
         <w:tc>
           <w:tcPr>
             <w:tcW w:type="dxa" w:w="1509"/>
@@ -12089,6 +12431,9 @@
         </w:tc>
       </w:tr>
       <w:tr>
+        <w:trPr>
+          <w:cantSplit/>
+        </w:trPr>
         <w:tc>
           <w:tcPr>
             <w:tcW w:type="dxa" w:w="1509"/>
@@ -12179,6 +12524,9 @@
         </w:tc>
       </w:tr>
       <w:tr>
+        <w:trPr>
+          <w:cantSplit/>
+        </w:trPr>
         <w:tc>
           <w:tcPr>
             <w:tcW w:type="dxa" w:w="1509"/>
@@ -12273,6 +12621,9 @@
         </w:tc>
       </w:tr>
       <w:tr>
+        <w:trPr>
+          <w:cantSplit/>
+        </w:trPr>
         <w:tc>
           <w:tcPr>
             <w:tcW w:type="dxa" w:w="1509"/>
@@ -12363,6 +12714,9 @@
         </w:tc>
       </w:tr>
       <w:tr>
+        <w:trPr>
+          <w:cantSplit/>
+        </w:trPr>
         <w:tc>
           <w:tcPr>
             <w:tcW w:type="dxa" w:w="1509"/>
@@ -12457,6 +12811,9 @@
         </w:tc>
       </w:tr>
       <w:tr>
+        <w:trPr>
+          <w:cantSplit/>
+        </w:trPr>
         <w:tc>
           <w:tcPr>
             <w:tcW w:type="dxa" w:w="1509"/>
@@ -12547,6 +12904,9 @@
         </w:tc>
       </w:tr>
       <w:tr>
+        <w:trPr>
+          <w:cantSplit/>
+        </w:trPr>
         <w:tc>
           <w:tcPr>
             <w:tcW w:type="dxa" w:w="1509"/>
@@ -12641,6 +13001,9 @@
         </w:tc>
       </w:tr>
       <w:tr>
+        <w:trPr>
+          <w:cantSplit/>
+        </w:trPr>
         <w:tc>
           <w:tcPr>
             <w:tcW w:type="dxa" w:w="1509"/>
@@ -12731,6 +13094,9 @@
         </w:tc>
       </w:tr>
       <w:tr>
+        <w:trPr>
+          <w:cantSplit/>
+        </w:trPr>
         <w:tc>
           <w:tcPr>
             <w:tcW w:type="dxa" w:w="1509"/>
@@ -12825,6 +13191,9 @@
         </w:tc>
       </w:tr>
       <w:tr>
+        <w:trPr>
+          <w:cantSplit/>
+        </w:trPr>
         <w:tc>
           <w:tcPr>
             <w:tcW w:type="dxa" w:w="1509"/>
@@ -12915,6 +13284,9 @@
         </w:tc>
       </w:tr>
       <w:tr>
+        <w:trPr>
+          <w:cantSplit/>
+        </w:trPr>
         <w:tc>
           <w:tcPr>
             <w:tcW w:type="dxa" w:w="1509"/>
@@ -13009,6 +13381,9 @@
         </w:tc>
       </w:tr>
       <w:tr>
+        <w:trPr>
+          <w:cantSplit/>
+        </w:trPr>
         <w:tc>
           <w:tcPr>
             <w:tcW w:type="dxa" w:w="1509"/>
@@ -13099,6 +13474,9 @@
         </w:tc>
       </w:tr>
       <w:tr>
+        <w:trPr>
+          <w:cantSplit/>
+        </w:trPr>
         <w:tc>
           <w:tcPr>
             <w:tcW w:type="dxa" w:w="1509"/>
@@ -13193,6 +13571,9 @@
         </w:tc>
       </w:tr>
       <w:tr>
+        <w:trPr>
+          <w:cantSplit/>
+        </w:trPr>
         <w:tc>
           <w:tcPr>
             <w:tcW w:type="dxa" w:w="1509"/>
@@ -13283,6 +13664,9 @@
         </w:tc>
       </w:tr>
       <w:tr>
+        <w:trPr>
+          <w:cantSplit/>
+        </w:trPr>
         <w:tc>
           <w:tcPr>
             <w:tcW w:type="dxa" w:w="1509"/>
@@ -13377,6 +13761,9 @@
         </w:tc>
       </w:tr>
       <w:tr>
+        <w:trPr>
+          <w:cantSplit/>
+        </w:trPr>
         <w:tc>
           <w:tcPr>
             <w:tcW w:type="dxa" w:w="1509"/>
@@ -13467,6 +13854,9 @@
         </w:tc>
       </w:tr>
       <w:tr>
+        <w:trPr>
+          <w:cantSplit/>
+        </w:trPr>
         <w:tc>
           <w:tcPr>
             <w:tcW w:type="dxa" w:w="1509"/>
@@ -13561,6 +13951,9 @@
         </w:tc>
       </w:tr>
       <w:tr>
+        <w:trPr>
+          <w:cantSplit/>
+        </w:trPr>
         <w:tc>
           <w:tcPr>
             <w:tcW w:type="dxa" w:w="1509"/>
@@ -13651,6 +14044,9 @@
         </w:tc>
       </w:tr>
       <w:tr>
+        <w:trPr>
+          <w:cantSplit/>
+        </w:trPr>
         <w:tc>
           <w:tcPr>
             <w:tcW w:type="dxa" w:w="1509"/>
@@ -13745,6 +14141,9 @@
         </w:tc>
       </w:tr>
       <w:tr>
+        <w:trPr>
+          <w:cantSplit/>
+        </w:trPr>
         <w:tc>
           <w:tcPr>
             <w:tcW w:type="dxa" w:w="1509"/>

</xml_diff>

<commit_message>
Figures renumbered to appearance order; Contents page with measured page numbers; README
Two-pass TOC fill via extract_toc.py; 39 pages, converged page numbers
verified. Raise status re-checked Jul 10 pm: still unclosed, note stands.

Co-Authored-By: Claude Fable 5 <noreply@anthropic.com>
Claude-Session: https://claude.ai/code/session_01TXNrMQSsp5SsvaYzynqJ6k
</commit_message>
<xml_diff>
--- a/output/Databricks_Initiation_Note_Jul2026.docx
+++ b/output/Databricks_Initiation_Note_Jul2026.docx
@@ -1548,6 +1548,1342 @@
         <w:pStyle w:val="Heading1"/>
       </w:pPr>
       <w:r>
+        <w:t>Contents</w:t>
+      </w:r>
+    </w:p>
+    <w:tbl>
+      <w:tblPr>
+        <w:tblW w:type="dxa" w:w="9360"/>
+        <w:tblLook w:firstColumn="1" w:firstRow="1" w:lastColumn="0" w:lastRow="0" w:noHBand="0" w:noVBand="1" w:val="04A0"/>
+        <w:tblCellMar>
+          <w:top w:w="26" w:type="dxa"/>
+          <w:left w:w="80" w:type="dxa"/>
+          <w:bottom w:w="26" w:type="dxa"/>
+          <w:right w:w="80" w:type="dxa"/>
+        </w:tblCellMar>
+      </w:tblPr>
+      <w:tblGrid>
+        <w:gridCol w:w="4680"/>
+        <w:gridCol w:w="4680"/>
+      </w:tblGrid>
+      <w:tr>
+        <w:tc>
+          <w:tcPr>
+            <w:tcW w:type="dxa" w:w="8460"/>
+          </w:tcPr>
+          <w:p>
+            <w:pPr>
+              <w:spacing w:after="0"/>
+              <w:jc w:val="left"/>
+            </w:pPr>
+            <w:r/>
+            <w:r>
+              <w:rPr>
+                <w:rFonts w:ascii="Georgia" w:hAnsi="Georgia"/>
+                <w:b w:val="0"/>
+                <w:i w:val="0"/>
+                <w:color w:val="262B35"/>
+                <w:sz w:val="18"/>
+              </w:rPr>
+              <w:t>Disclosure and Basis of Preparation</w:t>
+            </w:r>
+          </w:p>
+        </w:tc>
+        <w:tc>
+          <w:tcPr>
+            <w:tcW w:type="dxa" w:w="900"/>
+          </w:tcPr>
+          <w:p>
+            <w:pPr>
+              <w:spacing w:after="0"/>
+              <w:jc w:val="right"/>
+            </w:pPr>
+            <w:r/>
+            <w:r>
+              <w:rPr>
+                <w:rFonts w:ascii="Georgia" w:hAnsi="Georgia"/>
+                <w:b w:val="0"/>
+                <w:i w:val="0"/>
+                <w:color w:val="6B7280"/>
+                <w:sz w:val="17"/>
+              </w:rPr>
+              <w:t>2</w:t>
+            </w:r>
+          </w:p>
+        </w:tc>
+      </w:tr>
+      <w:tr>
+        <w:tc>
+          <w:tcPr>
+            <w:tcW w:type="dxa" w:w="8460"/>
+          </w:tcPr>
+          <w:p>
+            <w:pPr>
+              <w:spacing w:after="0"/>
+              <w:jc w:val="left"/>
+            </w:pPr>
+            <w:r/>
+            <w:r>
+              <w:rPr>
+                <w:rFonts w:ascii="Georgia" w:hAnsi="Georgia"/>
+                <w:b w:val="0"/>
+                <w:i w:val="0"/>
+                <w:color w:val="262B35"/>
+                <w:sz w:val="18"/>
+              </w:rPr>
+              <w:t>Executive Summary and Investment Thesis</w:t>
+            </w:r>
+          </w:p>
+        </w:tc>
+        <w:tc>
+          <w:tcPr>
+            <w:tcW w:type="dxa" w:w="900"/>
+          </w:tcPr>
+          <w:p>
+            <w:pPr>
+              <w:spacing w:after="0"/>
+              <w:jc w:val="right"/>
+            </w:pPr>
+            <w:r/>
+            <w:r>
+              <w:rPr>
+                <w:rFonts w:ascii="Georgia" w:hAnsi="Georgia"/>
+                <w:b w:val="0"/>
+                <w:i w:val="0"/>
+                <w:color w:val="6B7280"/>
+                <w:sz w:val="17"/>
+              </w:rPr>
+              <w:t>4</w:t>
+            </w:r>
+          </w:p>
+        </w:tc>
+      </w:tr>
+      <w:tr>
+        <w:tc>
+          <w:tcPr>
+            <w:tcW w:type="dxa" w:w="8460"/>
+          </w:tcPr>
+          <w:p>
+            <w:pPr>
+              <w:spacing w:after="0"/>
+              <w:jc w:val="left"/>
+            </w:pPr>
+            <w:r/>
+            <w:r>
+              <w:rPr>
+                <w:rFonts w:ascii="Georgia" w:hAnsi="Georgia"/>
+                <w:b w:val="0"/>
+                <w:i w:val="0"/>
+                <w:color w:val="262B35"/>
+                <w:sz w:val="18"/>
+              </w:rPr>
+              <w:t>The AIBQ Rating: Full Breakdown</w:t>
+            </w:r>
+          </w:p>
+        </w:tc>
+        <w:tc>
+          <w:tcPr>
+            <w:tcW w:type="dxa" w:w="900"/>
+          </w:tcPr>
+          <w:p>
+            <w:pPr>
+              <w:spacing w:after="0"/>
+              <w:jc w:val="right"/>
+            </w:pPr>
+            <w:r/>
+            <w:r>
+              <w:rPr>
+                <w:rFonts w:ascii="Georgia" w:hAnsi="Georgia"/>
+                <w:b w:val="0"/>
+                <w:i w:val="0"/>
+                <w:color w:val="6B7280"/>
+                <w:sz w:val="17"/>
+              </w:rPr>
+              <w:t>7</w:t>
+            </w:r>
+          </w:p>
+        </w:tc>
+      </w:tr>
+      <w:tr>
+        <w:tc>
+          <w:tcPr>
+            <w:tcW w:type="dxa" w:w="8460"/>
+          </w:tcPr>
+          <w:p>
+            <w:pPr>
+              <w:spacing w:after="0"/>
+              <w:jc w:val="left"/>
+            </w:pPr>
+            <w:r/>
+            <w:r>
+              <w:rPr>
+                <w:rFonts w:ascii="Georgia" w:hAnsi="Georgia"/>
+                <w:b w:val="0"/>
+                <w:i w:val="0"/>
+                <w:color w:val="262B35"/>
+                <w:sz w:val="18"/>
+              </w:rPr>
+              <w:t>Business Model and the Lakehouse</w:t>
+            </w:r>
+          </w:p>
+        </w:tc>
+        <w:tc>
+          <w:tcPr>
+            <w:tcW w:type="dxa" w:w="900"/>
+          </w:tcPr>
+          <w:p>
+            <w:pPr>
+              <w:spacing w:after="0"/>
+              <w:jc w:val="right"/>
+            </w:pPr>
+            <w:r/>
+            <w:r>
+              <w:rPr>
+                <w:rFonts w:ascii="Georgia" w:hAnsi="Georgia"/>
+                <w:b w:val="0"/>
+                <w:i w:val="0"/>
+                <w:color w:val="6B7280"/>
+                <w:sz w:val="17"/>
+              </w:rPr>
+              <w:t>13</w:t>
+            </w:r>
+          </w:p>
+        </w:tc>
+      </w:tr>
+      <w:tr>
+        <w:tc>
+          <w:tcPr>
+            <w:tcW w:type="dxa" w:w="8460"/>
+          </w:tcPr>
+          <w:p>
+            <w:pPr>
+              <w:spacing w:after="0"/>
+              <w:jc w:val="left"/>
+            </w:pPr>
+            <w:r/>
+            <w:r>
+              <w:rPr>
+                <w:rFonts w:ascii="Georgia" w:hAnsi="Georgia"/>
+                <w:b w:val="0"/>
+                <w:i w:val="0"/>
+                <w:color w:val="262B35"/>
+                <w:sz w:val="18"/>
+              </w:rPr>
+              <w:t>Products and Services Deep Dive</w:t>
+            </w:r>
+          </w:p>
+        </w:tc>
+        <w:tc>
+          <w:tcPr>
+            <w:tcW w:type="dxa" w:w="900"/>
+          </w:tcPr>
+          <w:p>
+            <w:pPr>
+              <w:spacing w:after="0"/>
+              <w:jc w:val="right"/>
+            </w:pPr>
+            <w:r/>
+            <w:r>
+              <w:rPr>
+                <w:rFonts w:ascii="Georgia" w:hAnsi="Georgia"/>
+                <w:b w:val="0"/>
+                <w:i w:val="0"/>
+                <w:color w:val="6B7280"/>
+                <w:sz w:val="17"/>
+              </w:rPr>
+              <w:t>14</w:t>
+            </w:r>
+          </w:p>
+        </w:tc>
+      </w:tr>
+      <w:tr>
+        <w:tc>
+          <w:tcPr>
+            <w:tcW w:type="dxa" w:w="8460"/>
+          </w:tcPr>
+          <w:p>
+            <w:pPr>
+              <w:spacing w:after="0"/>
+              <w:jc w:val="left"/>
+            </w:pPr>
+            <w:r/>
+            <w:r>
+              <w:rPr>
+                <w:rFonts w:ascii="Georgia" w:hAnsi="Georgia"/>
+                <w:b w:val="0"/>
+                <w:i w:val="0"/>
+                <w:color w:val="262B35"/>
+                <w:sz w:val="18"/>
+              </w:rPr>
+              <w:t>AI Focus: Where the Models End and the Business Begins</w:t>
+            </w:r>
+          </w:p>
+        </w:tc>
+        <w:tc>
+          <w:tcPr>
+            <w:tcW w:type="dxa" w:w="900"/>
+          </w:tcPr>
+          <w:p>
+            <w:pPr>
+              <w:spacing w:after="0"/>
+              <w:jc w:val="right"/>
+            </w:pPr>
+            <w:r/>
+            <w:r>
+              <w:rPr>
+                <w:rFonts w:ascii="Georgia" w:hAnsi="Georgia"/>
+                <w:b w:val="0"/>
+                <w:i w:val="0"/>
+                <w:color w:val="6B7280"/>
+                <w:sz w:val="17"/>
+              </w:rPr>
+              <w:t>16</w:t>
+            </w:r>
+          </w:p>
+        </w:tc>
+      </w:tr>
+      <w:tr>
+        <w:tc>
+          <w:tcPr>
+            <w:tcW w:type="dxa" w:w="8460"/>
+          </w:tcPr>
+          <w:p>
+            <w:pPr>
+              <w:spacing w:after="0"/>
+              <w:jc w:val="left"/>
+            </w:pPr>
+            <w:r/>
+            <w:r>
+              <w:rPr>
+                <w:rFonts w:ascii="Georgia" w:hAnsi="Georgia"/>
+                <w:b w:val="0"/>
+                <w:i w:val="0"/>
+                <w:color w:val="262B35"/>
+                <w:sz w:val="18"/>
+              </w:rPr>
+              <w:t>Financials</w:t>
+            </w:r>
+          </w:p>
+        </w:tc>
+        <w:tc>
+          <w:tcPr>
+            <w:tcW w:type="dxa" w:w="900"/>
+          </w:tcPr>
+          <w:p>
+            <w:pPr>
+              <w:spacing w:after="0"/>
+              <w:jc w:val="right"/>
+            </w:pPr>
+            <w:r/>
+            <w:r>
+              <w:rPr>
+                <w:rFonts w:ascii="Georgia" w:hAnsi="Georgia"/>
+                <w:b w:val="0"/>
+                <w:i w:val="0"/>
+                <w:color w:val="6B7280"/>
+                <w:sz w:val="17"/>
+              </w:rPr>
+              <w:t>18</w:t>
+            </w:r>
+          </w:p>
+        </w:tc>
+      </w:tr>
+      <w:tr>
+        <w:tc>
+          <w:tcPr>
+            <w:tcW w:type="dxa" w:w="8460"/>
+          </w:tcPr>
+          <w:p>
+            <w:pPr>
+              <w:spacing w:after="0"/>
+              <w:jc w:val="left"/>
+            </w:pPr>
+            <w:r/>
+            <w:r>
+              <w:rPr>
+                <w:rFonts w:ascii="Georgia" w:hAnsi="Georgia"/>
+                <w:b w:val="0"/>
+                <w:i w:val="0"/>
+                <w:color w:val="262B35"/>
+                <w:sz w:val="18"/>
+              </w:rPr>
+              <w:t>Capital Structure and Capital Efficiency</w:t>
+            </w:r>
+          </w:p>
+        </w:tc>
+        <w:tc>
+          <w:tcPr>
+            <w:tcW w:type="dxa" w:w="900"/>
+          </w:tcPr>
+          <w:p>
+            <w:pPr>
+              <w:spacing w:after="0"/>
+              <w:jc w:val="right"/>
+            </w:pPr>
+            <w:r/>
+            <w:r>
+              <w:rPr>
+                <w:rFonts w:ascii="Georgia" w:hAnsi="Georgia"/>
+                <w:b w:val="0"/>
+                <w:i w:val="0"/>
+                <w:color w:val="6B7280"/>
+                <w:sz w:val="17"/>
+              </w:rPr>
+              <w:t>21</w:t>
+            </w:r>
+          </w:p>
+        </w:tc>
+      </w:tr>
+      <w:tr>
+        <w:tc>
+          <w:tcPr>
+            <w:tcW w:type="dxa" w:w="8460"/>
+          </w:tcPr>
+          <w:p>
+            <w:pPr>
+              <w:spacing w:after="0"/>
+              <w:jc w:val="left"/>
+            </w:pPr>
+            <w:r/>
+            <w:r>
+              <w:rPr>
+                <w:rFonts w:ascii="Georgia" w:hAnsi="Georgia"/>
+                <w:b w:val="0"/>
+                <w:i w:val="0"/>
+                <w:color w:val="262B35"/>
+                <w:sz w:val="18"/>
+              </w:rPr>
+              <w:t>The Upcoming Raise: Analyzed, Not Adopted</w:t>
+            </w:r>
+          </w:p>
+        </w:tc>
+        <w:tc>
+          <w:tcPr>
+            <w:tcW w:type="dxa" w:w="900"/>
+          </w:tcPr>
+          <w:p>
+            <w:pPr>
+              <w:spacing w:after="0"/>
+              <w:jc w:val="right"/>
+            </w:pPr>
+            <w:r/>
+            <w:r>
+              <w:rPr>
+                <w:rFonts w:ascii="Georgia" w:hAnsi="Georgia"/>
+                <w:b w:val="0"/>
+                <w:i w:val="0"/>
+                <w:color w:val="6B7280"/>
+                <w:sz w:val="17"/>
+              </w:rPr>
+              <w:t>23</w:t>
+            </w:r>
+          </w:p>
+        </w:tc>
+      </w:tr>
+      <w:tr>
+        <w:tc>
+          <w:tcPr>
+            <w:tcW w:type="dxa" w:w="8460"/>
+          </w:tcPr>
+          <w:p>
+            <w:pPr>
+              <w:spacing w:after="0"/>
+              <w:jc w:val="left"/>
+            </w:pPr>
+            <w:r/>
+            <w:r>
+              <w:rPr>
+                <w:rFonts w:ascii="Georgia" w:hAnsi="Georgia"/>
+                <w:b w:val="0"/>
+                <w:i w:val="0"/>
+                <w:color w:val="262B35"/>
+                <w:sz w:val="18"/>
+              </w:rPr>
+              <w:t>Competitive Position and the Moat</w:t>
+            </w:r>
+          </w:p>
+        </w:tc>
+        <w:tc>
+          <w:tcPr>
+            <w:tcW w:type="dxa" w:w="900"/>
+          </w:tcPr>
+          <w:p>
+            <w:pPr>
+              <w:spacing w:after="0"/>
+              <w:jc w:val="right"/>
+            </w:pPr>
+            <w:r/>
+            <w:r>
+              <w:rPr>
+                <w:rFonts w:ascii="Georgia" w:hAnsi="Georgia"/>
+                <w:b w:val="0"/>
+                <w:i w:val="0"/>
+                <w:color w:val="6B7280"/>
+                <w:sz w:val="17"/>
+              </w:rPr>
+              <w:t>24</w:t>
+            </w:r>
+          </w:p>
+        </w:tc>
+      </w:tr>
+      <w:tr>
+        <w:tc>
+          <w:tcPr>
+            <w:tcW w:type="dxa" w:w="8460"/>
+          </w:tcPr>
+          <w:p>
+            <w:pPr>
+              <w:spacing w:after="0"/>
+              <w:jc w:val="left"/>
+            </w:pPr>
+            <w:r/>
+            <w:r>
+              <w:rPr>
+                <w:rFonts w:ascii="Georgia" w:hAnsi="Georgia"/>
+                <w:b w:val="0"/>
+                <w:i w:val="0"/>
+                <w:color w:val="262B35"/>
+                <w:sz w:val="18"/>
+              </w:rPr>
+              <w:t>Market Implications and Category</w:t>
+            </w:r>
+          </w:p>
+        </w:tc>
+        <w:tc>
+          <w:tcPr>
+            <w:tcW w:type="dxa" w:w="900"/>
+          </w:tcPr>
+          <w:p>
+            <w:pPr>
+              <w:spacing w:after="0"/>
+              <w:jc w:val="right"/>
+            </w:pPr>
+            <w:r/>
+            <w:r>
+              <w:rPr>
+                <w:rFonts w:ascii="Georgia" w:hAnsi="Georgia"/>
+                <w:b w:val="0"/>
+                <w:i w:val="0"/>
+                <w:color w:val="6B7280"/>
+                <w:sz w:val="17"/>
+              </w:rPr>
+              <w:t>26</w:t>
+            </w:r>
+          </w:p>
+        </w:tc>
+      </w:tr>
+      <w:tr>
+        <w:tc>
+          <w:tcPr>
+            <w:tcW w:type="dxa" w:w="8460"/>
+          </w:tcPr>
+          <w:p>
+            <w:pPr>
+              <w:spacing w:after="0"/>
+              <w:jc w:val="left"/>
+            </w:pPr>
+            <w:r/>
+            <w:r>
+              <w:rPr>
+                <w:rFonts w:ascii="Georgia" w:hAnsi="Georgia"/>
+                <w:b w:val="0"/>
+                <w:i w:val="0"/>
+                <w:color w:val="262B35"/>
+                <w:sz w:val="18"/>
+              </w:rPr>
+              <w:t>The IPO as the Convergence Event</w:t>
+            </w:r>
+          </w:p>
+        </w:tc>
+        <w:tc>
+          <w:tcPr>
+            <w:tcW w:type="dxa" w:w="900"/>
+          </w:tcPr>
+          <w:p>
+            <w:pPr>
+              <w:spacing w:after="0"/>
+              <w:jc w:val="right"/>
+            </w:pPr>
+            <w:r/>
+            <w:r>
+              <w:rPr>
+                <w:rFonts w:ascii="Georgia" w:hAnsi="Georgia"/>
+                <w:b w:val="0"/>
+                <w:i w:val="0"/>
+                <w:color w:val="6B7280"/>
+                <w:sz w:val="17"/>
+              </w:rPr>
+              <w:t>27</w:t>
+            </w:r>
+          </w:p>
+        </w:tc>
+      </w:tr>
+      <w:tr>
+        <w:tc>
+          <w:tcPr>
+            <w:tcW w:type="dxa" w:w="8460"/>
+          </w:tcPr>
+          <w:p>
+            <w:pPr>
+              <w:spacing w:after="0"/>
+              <w:jc w:val="left"/>
+            </w:pPr>
+            <w:r/>
+            <w:r>
+              <w:rPr>
+                <w:rFonts w:ascii="Georgia" w:hAnsi="Georgia"/>
+                <w:b w:val="0"/>
+                <w:i w:val="0"/>
+                <w:color w:val="262B35"/>
+                <w:sz w:val="18"/>
+              </w:rPr>
+              <w:t>Valuation and Scenarios</w:t>
+            </w:r>
+          </w:p>
+        </w:tc>
+        <w:tc>
+          <w:tcPr>
+            <w:tcW w:type="dxa" w:w="900"/>
+          </w:tcPr>
+          <w:p>
+            <w:pPr>
+              <w:spacing w:after="0"/>
+              <w:jc w:val="right"/>
+            </w:pPr>
+            <w:r/>
+            <w:r>
+              <w:rPr>
+                <w:rFonts w:ascii="Georgia" w:hAnsi="Georgia"/>
+                <w:b w:val="0"/>
+                <w:i w:val="0"/>
+                <w:color w:val="6B7280"/>
+                <w:sz w:val="17"/>
+              </w:rPr>
+              <w:t>29</w:t>
+            </w:r>
+          </w:p>
+        </w:tc>
+      </w:tr>
+      <w:tr>
+        <w:tc>
+          <w:tcPr>
+            <w:tcW w:type="dxa" w:w="8460"/>
+          </w:tcPr>
+          <w:p>
+            <w:pPr>
+              <w:spacing w:after="0"/>
+              <w:jc w:val="left"/>
+            </w:pPr>
+            <w:r/>
+            <w:r>
+              <w:rPr>
+                <w:rFonts w:ascii="Georgia" w:hAnsi="Georgia"/>
+                <w:b w:val="0"/>
+                <w:i w:val="0"/>
+                <w:color w:val="262B35"/>
+                <w:sz w:val="18"/>
+              </w:rPr>
+              <w:t>Risks and What Would Change Our Mind</w:t>
+            </w:r>
+          </w:p>
+        </w:tc>
+        <w:tc>
+          <w:tcPr>
+            <w:tcW w:type="dxa" w:w="900"/>
+          </w:tcPr>
+          <w:p>
+            <w:pPr>
+              <w:spacing w:after="0"/>
+              <w:jc w:val="right"/>
+            </w:pPr>
+            <w:r/>
+            <w:r>
+              <w:rPr>
+                <w:rFonts w:ascii="Georgia" w:hAnsi="Georgia"/>
+                <w:b w:val="0"/>
+                <w:i w:val="0"/>
+                <w:color w:val="6B7280"/>
+                <w:sz w:val="17"/>
+              </w:rPr>
+              <w:t>32</w:t>
+            </w:r>
+          </w:p>
+        </w:tc>
+      </w:tr>
+      <w:tr>
+        <w:tc>
+          <w:tcPr>
+            <w:tcW w:type="dxa" w:w="8460"/>
+          </w:tcPr>
+          <w:p>
+            <w:pPr>
+              <w:spacing w:after="0"/>
+              <w:jc w:val="left"/>
+            </w:pPr>
+            <w:r/>
+            <w:r>
+              <w:rPr>
+                <w:rFonts w:ascii="Georgia" w:hAnsi="Georgia"/>
+                <w:b w:val="0"/>
+                <w:i w:val="0"/>
+                <w:color w:val="262B35"/>
+                <w:sz w:val="18"/>
+              </w:rPr>
+              <w:t>Management and Governance</w:t>
+            </w:r>
+          </w:p>
+        </w:tc>
+        <w:tc>
+          <w:tcPr>
+            <w:tcW w:type="dxa" w:w="900"/>
+          </w:tcPr>
+          <w:p>
+            <w:pPr>
+              <w:spacing w:after="0"/>
+              <w:jc w:val="right"/>
+            </w:pPr>
+            <w:r/>
+            <w:r>
+              <w:rPr>
+                <w:rFonts w:ascii="Georgia" w:hAnsi="Georgia"/>
+                <w:b w:val="0"/>
+                <w:i w:val="0"/>
+                <w:color w:val="6B7280"/>
+                <w:sz w:val="17"/>
+              </w:rPr>
+              <w:t>34</w:t>
+            </w:r>
+          </w:p>
+        </w:tc>
+      </w:tr>
+      <w:tr>
+        <w:tc>
+          <w:tcPr>
+            <w:tcW w:type="dxa" w:w="8460"/>
+          </w:tcPr>
+          <w:p>
+            <w:pPr>
+              <w:spacing w:after="0"/>
+              <w:jc w:val="left"/>
+            </w:pPr>
+            <w:r/>
+            <w:r>
+              <w:rPr>
+                <w:rFonts w:ascii="Georgia" w:hAnsi="Georgia"/>
+                <w:b w:val="0"/>
+                <w:i w:val="0"/>
+                <w:color w:val="262B35"/>
+                <w:sz w:val="18"/>
+              </w:rPr>
+              <w:t>Recommendation and Positioning</w:t>
+            </w:r>
+          </w:p>
+        </w:tc>
+        <w:tc>
+          <w:tcPr>
+            <w:tcW w:type="dxa" w:w="900"/>
+          </w:tcPr>
+          <w:p>
+            <w:pPr>
+              <w:spacing w:after="0"/>
+              <w:jc w:val="right"/>
+            </w:pPr>
+            <w:r/>
+            <w:r>
+              <w:rPr>
+                <w:rFonts w:ascii="Georgia" w:hAnsi="Georgia"/>
+                <w:b w:val="0"/>
+                <w:i w:val="0"/>
+                <w:color w:val="6B7280"/>
+                <w:sz w:val="17"/>
+              </w:rPr>
+              <w:t>35</w:t>
+            </w:r>
+          </w:p>
+        </w:tc>
+      </w:tr>
+      <w:tr>
+        <w:tc>
+          <w:tcPr>
+            <w:tcW w:type="dxa" w:w="8460"/>
+          </w:tcPr>
+          <w:p>
+            <w:pPr>
+              <w:spacing w:after="0"/>
+              <w:jc w:val="left"/>
+            </w:pPr>
+            <w:r/>
+            <w:r>
+              <w:rPr>
+                <w:rFonts w:ascii="Georgia" w:hAnsi="Georgia"/>
+                <w:b w:val="0"/>
+                <w:i w:val="0"/>
+                <w:color w:val="262B35"/>
+                <w:sz w:val="18"/>
+              </w:rPr>
+              <w:t>Appendix A: The AIBQ Framework</w:t>
+            </w:r>
+          </w:p>
+        </w:tc>
+        <w:tc>
+          <w:tcPr>
+            <w:tcW w:type="dxa" w:w="900"/>
+          </w:tcPr>
+          <w:p>
+            <w:pPr>
+              <w:spacing w:after="0"/>
+              <w:jc w:val="right"/>
+            </w:pPr>
+            <w:r/>
+            <w:r>
+              <w:rPr>
+                <w:rFonts w:ascii="Georgia" w:hAnsi="Georgia"/>
+                <w:b w:val="0"/>
+                <w:i w:val="0"/>
+                <w:color w:val="6B7280"/>
+                <w:sz w:val="17"/>
+              </w:rPr>
+              <w:t>36</w:t>
+            </w:r>
+          </w:p>
+        </w:tc>
+      </w:tr>
+      <w:tr>
+        <w:tc>
+          <w:tcPr>
+            <w:tcW w:type="dxa" w:w="8460"/>
+          </w:tcPr>
+          <w:p>
+            <w:pPr>
+              <w:spacing w:after="0"/>
+              <w:jc w:val="left"/>
+            </w:pPr>
+            <w:r/>
+            <w:r>
+              <w:rPr>
+                <w:rFonts w:ascii="Georgia" w:hAnsi="Georgia"/>
+                <w:b w:val="0"/>
+                <w:i w:val="0"/>
+                <w:color w:val="262B35"/>
+                <w:sz w:val="18"/>
+              </w:rPr>
+              <w:t>Appendix B: Sources and Tiering</w:t>
+            </w:r>
+          </w:p>
+        </w:tc>
+        <w:tc>
+          <w:tcPr>
+            <w:tcW w:type="dxa" w:w="900"/>
+          </w:tcPr>
+          <w:p>
+            <w:pPr>
+              <w:spacing w:after="0"/>
+              <w:jc w:val="right"/>
+            </w:pPr>
+            <w:r/>
+            <w:r>
+              <w:rPr>
+                <w:rFonts w:ascii="Georgia" w:hAnsi="Georgia"/>
+                <w:b w:val="0"/>
+                <w:i w:val="0"/>
+                <w:color w:val="6B7280"/>
+                <w:sz w:val="17"/>
+              </w:rPr>
+              <w:t>38</w:t>
+            </w:r>
+          </w:p>
+        </w:tc>
+      </w:tr>
+    </w:tbl>
+    <w:p>
+      <w:pPr>
+        <w:pStyle w:val="Heading3"/>
+      </w:pPr>
+      <w:r>
+        <w:t>Exhibits</w:t>
+      </w:r>
+    </w:p>
+    <w:tbl>
+      <w:tblPr>
+        <w:tblW w:type="dxa" w:w="9360"/>
+        <w:tblLook w:firstColumn="1" w:firstRow="1" w:lastColumn="0" w:lastRow="0" w:noHBand="0" w:noVBand="1" w:val="04A0"/>
+        <w:tblCellMar>
+          <w:top w:w="22" w:type="dxa"/>
+          <w:left w:w="80" w:type="dxa"/>
+          <w:bottom w:w="22" w:type="dxa"/>
+          <w:right w:w="80" w:type="dxa"/>
+        </w:tblCellMar>
+      </w:tblPr>
+      <w:tblGrid>
+        <w:gridCol w:w="4680"/>
+        <w:gridCol w:w="4680"/>
+      </w:tblGrid>
+      <w:tr>
+        <w:tc>
+          <w:tcPr>
+            <w:tcW w:type="dxa" w:w="8460"/>
+          </w:tcPr>
+          <w:p>
+            <w:pPr>
+              <w:spacing w:after="0"/>
+              <w:jc w:val="left"/>
+            </w:pPr>
+            <w:r/>
+            <w:r>
+              <w:rPr>
+                <w:rFonts w:ascii="Georgia" w:hAnsi="Georgia"/>
+                <w:b w:val="0"/>
+                <w:i w:val="0"/>
+                <w:color w:val="262B35"/>
+                <w:sz w:val="17"/>
+              </w:rPr>
+              <w:t>Figure 1.  The per-point ladder: valuation per unit of quality</w:t>
+            </w:r>
+          </w:p>
+        </w:tc>
+        <w:tc>
+          <w:tcPr>
+            <w:tcW w:type="dxa" w:w="900"/>
+          </w:tcPr>
+          <w:p>
+            <w:pPr>
+              <w:spacing w:after="0"/>
+              <w:jc w:val="right"/>
+            </w:pPr>
+            <w:r/>
+            <w:r>
+              <w:rPr>
+                <w:rFonts w:ascii="Georgia" w:hAnsi="Georgia"/>
+                <w:b w:val="0"/>
+                <w:i w:val="0"/>
+                <w:color w:val="6B7280"/>
+                <w:sz w:val="17"/>
+              </w:rPr>
+              <w:t>6</w:t>
+            </w:r>
+          </w:p>
+        </w:tc>
+      </w:tr>
+      <w:tr>
+        <w:tc>
+          <w:tcPr>
+            <w:tcW w:type="dxa" w:w="8460"/>
+          </w:tcPr>
+          <w:p>
+            <w:pPr>
+              <w:spacing w:after="0"/>
+              <w:jc w:val="left"/>
+            </w:pPr>
+            <w:r/>
+            <w:r>
+              <w:rPr>
+                <w:rFonts w:ascii="Georgia" w:hAnsi="Georgia"/>
+                <w:b w:val="0"/>
+                <w:i w:val="0"/>
+                <w:color w:val="262B35"/>
+                <w:sz w:val="17"/>
+              </w:rPr>
+              <w:t>Figure 2.  AIBQ dimension radar, Databricks vs cohort average</w:t>
+            </w:r>
+          </w:p>
+        </w:tc>
+        <w:tc>
+          <w:tcPr>
+            <w:tcW w:type="dxa" w:w="900"/>
+          </w:tcPr>
+          <w:p>
+            <w:pPr>
+              <w:spacing w:after="0"/>
+              <w:jc w:val="right"/>
+            </w:pPr>
+            <w:r/>
+            <w:r>
+              <w:rPr>
+                <w:rFonts w:ascii="Georgia" w:hAnsi="Georgia"/>
+                <w:b w:val="0"/>
+                <w:i w:val="0"/>
+                <w:color w:val="6B7280"/>
+                <w:sz w:val="17"/>
+              </w:rPr>
+              <w:t>12</w:t>
+            </w:r>
+          </w:p>
+        </w:tc>
+      </w:tr>
+      <w:tr>
+        <w:tc>
+          <w:tcPr>
+            <w:tcW w:type="dxa" w:w="8460"/>
+          </w:tcPr>
+          <w:p>
+            <w:pPr>
+              <w:spacing w:after="0"/>
+              <w:jc w:val="left"/>
+            </w:pPr>
+            <w:r/>
+            <w:r>
+              <w:rPr>
+                <w:rFonts w:ascii="Georgia" w:hAnsi="Georgia"/>
+                <w:b w:val="0"/>
+                <w:i w:val="0"/>
+                <w:color w:val="262B35"/>
+                <w:sz w:val="17"/>
+              </w:rPr>
+              <w:t>Figure 3.  Revenue composition by product line</w:t>
+            </w:r>
+          </w:p>
+        </w:tc>
+        <w:tc>
+          <w:tcPr>
+            <w:tcW w:type="dxa" w:w="900"/>
+          </w:tcPr>
+          <w:p>
+            <w:pPr>
+              <w:spacing w:after="0"/>
+              <w:jc w:val="right"/>
+            </w:pPr>
+            <w:r/>
+            <w:r>
+              <w:rPr>
+                <w:rFonts w:ascii="Georgia" w:hAnsi="Georgia"/>
+                <w:b w:val="0"/>
+                <w:i w:val="0"/>
+                <w:color w:val="6B7280"/>
+                <w:sz w:val="17"/>
+              </w:rPr>
+              <w:t>17</w:t>
+            </w:r>
+          </w:p>
+        </w:tc>
+      </w:tr>
+      <w:tr>
+        <w:tc>
+          <w:tcPr>
+            <w:tcW w:type="dxa" w:w="8460"/>
+          </w:tcPr>
+          <w:p>
+            <w:pPr>
+              <w:spacing w:after="0"/>
+              <w:jc w:val="left"/>
+            </w:pPr>
+            <w:r/>
+            <w:r>
+              <w:rPr>
+                <w:rFonts w:ascii="Georgia" w:hAnsi="Georgia"/>
+                <w:b w:val="0"/>
+                <w:i w:val="0"/>
+                <w:color w:val="262B35"/>
+                <w:sz w:val="17"/>
+              </w:rPr>
+              <w:t>Figure 4.  The acceleration: run-rate and growth, four prints</w:t>
+            </w:r>
+          </w:p>
+        </w:tc>
+        <w:tc>
+          <w:tcPr>
+            <w:tcW w:type="dxa" w:w="900"/>
+          </w:tcPr>
+          <w:p>
+            <w:pPr>
+              <w:spacing w:after="0"/>
+              <w:jc w:val="right"/>
+            </w:pPr>
+            <w:r/>
+            <w:r>
+              <w:rPr>
+                <w:rFonts w:ascii="Georgia" w:hAnsi="Georgia"/>
+                <w:b w:val="0"/>
+                <w:i w:val="0"/>
+                <w:color w:val="6B7280"/>
+                <w:sz w:val="17"/>
+              </w:rPr>
+              <w:t>18</w:t>
+            </w:r>
+          </w:p>
+        </w:tc>
+      </w:tr>
+      <w:tr>
+        <w:tc>
+          <w:tcPr>
+            <w:tcW w:type="dxa" w:w="8460"/>
+          </w:tcPr>
+          <w:p>
+            <w:pPr>
+              <w:spacing w:after="0"/>
+              <w:jc w:val="left"/>
+            </w:pPr>
+            <w:r/>
+            <w:r>
+              <w:rPr>
+                <w:rFonts w:ascii="Georgia" w:hAnsi="Georgia"/>
+                <w:b w:val="0"/>
+                <w:i w:val="0"/>
+                <w:color w:val="262B35"/>
+                <w:sz w:val="17"/>
+              </w:rPr>
+              <w:t>Figure 5.  Gross margin vs the 70% efficiency gate</w:t>
+            </w:r>
+          </w:p>
+        </w:tc>
+        <w:tc>
+          <w:tcPr>
+            <w:tcW w:type="dxa" w:w="900"/>
+          </w:tcPr>
+          <w:p>
+            <w:pPr>
+              <w:spacing w:after="0"/>
+              <w:jc w:val="right"/>
+            </w:pPr>
+            <w:r/>
+            <w:r>
+              <w:rPr>
+                <w:rFonts w:ascii="Georgia" w:hAnsi="Georgia"/>
+                <w:b w:val="0"/>
+                <w:i w:val="0"/>
+                <w:color w:val="6B7280"/>
+                <w:sz w:val="17"/>
+              </w:rPr>
+              <w:t>19</w:t>
+            </w:r>
+          </w:p>
+        </w:tc>
+      </w:tr>
+      <w:tr>
+        <w:tc>
+          <w:tcPr>
+            <w:tcW w:type="dxa" w:w="8460"/>
+          </w:tcPr>
+          <w:p>
+            <w:pPr>
+              <w:spacing w:after="0"/>
+              <w:jc w:val="left"/>
+            </w:pPr>
+            <w:r/>
+            <w:r>
+              <w:rPr>
+                <w:rFonts w:ascii="Georgia" w:hAnsi="Georgia"/>
+                <w:b w:val="0"/>
+                <w:i w:val="0"/>
+                <w:color w:val="262B35"/>
+                <w:sz w:val="17"/>
+              </w:rPr>
+              <w:t>Figure 6.  Capital efficiency across the Frontier Five</w:t>
+            </w:r>
+          </w:p>
+        </w:tc>
+        <w:tc>
+          <w:tcPr>
+            <w:tcW w:type="dxa" w:w="900"/>
+          </w:tcPr>
+          <w:p>
+            <w:pPr>
+              <w:spacing w:after="0"/>
+              <w:jc w:val="right"/>
+            </w:pPr>
+            <w:r/>
+            <w:r>
+              <w:rPr>
+                <w:rFonts w:ascii="Georgia" w:hAnsi="Georgia"/>
+                <w:b w:val="0"/>
+                <w:i w:val="0"/>
+                <w:color w:val="6B7280"/>
+                <w:sz w:val="17"/>
+              </w:rPr>
+              <w:t>22</w:t>
+            </w:r>
+          </w:p>
+        </w:tc>
+      </w:tr>
+      <w:tr>
+        <w:tc>
+          <w:tcPr>
+            <w:tcW w:type="dxa" w:w="8460"/>
+          </w:tcPr>
+          <w:p>
+            <w:pPr>
+              <w:spacing w:after="0"/>
+              <w:jc w:val="left"/>
+            </w:pPr>
+            <w:r/>
+            <w:r>
+              <w:rPr>
+                <w:rFonts w:ascii="Georgia" w:hAnsi="Georgia"/>
+                <w:b w:val="0"/>
+                <w:i w:val="0"/>
+                <w:color w:val="262B35"/>
+                <w:sz w:val="17"/>
+              </w:rPr>
+              <w:t>Figure 7.  Growth-adjusted multiples vs Snowflake</w:t>
+            </w:r>
+          </w:p>
+        </w:tc>
+        <w:tc>
+          <w:tcPr>
+            <w:tcW w:type="dxa" w:w="900"/>
+          </w:tcPr>
+          <w:p>
+            <w:pPr>
+              <w:spacing w:after="0"/>
+              <w:jc w:val="right"/>
+            </w:pPr>
+            <w:r/>
+            <w:r>
+              <w:rPr>
+                <w:rFonts w:ascii="Georgia" w:hAnsi="Georgia"/>
+                <w:b w:val="0"/>
+                <w:i w:val="0"/>
+                <w:color w:val="6B7280"/>
+                <w:sz w:val="17"/>
+              </w:rPr>
+              <w:t>24</w:t>
+            </w:r>
+          </w:p>
+        </w:tc>
+      </w:tr>
+      <w:tr>
+        <w:tc>
+          <w:tcPr>
+            <w:tcW w:type="dxa" w:w="8460"/>
+          </w:tcPr>
+          <w:p>
+            <w:pPr>
+              <w:spacing w:after="0"/>
+              <w:jc w:val="left"/>
+            </w:pPr>
+            <w:r/>
+            <w:r>
+              <w:rPr>
+                <w:rFonts w:ascii="Georgia" w:hAnsi="Georgia"/>
+                <w:b w:val="0"/>
+                <w:i w:val="0"/>
+                <w:color w:val="262B35"/>
+                <w:sz w:val="17"/>
+              </w:rPr>
+              <w:t>Figure 8.  The absorption wall: listings vs issuance capacity</w:t>
+            </w:r>
+          </w:p>
+        </w:tc>
+        <w:tc>
+          <w:tcPr>
+            <w:tcW w:type="dxa" w:w="900"/>
+          </w:tcPr>
+          <w:p>
+            <w:pPr>
+              <w:spacing w:after="0"/>
+              <w:jc w:val="right"/>
+            </w:pPr>
+            <w:r/>
+            <w:r>
+              <w:rPr>
+                <w:rFonts w:ascii="Georgia" w:hAnsi="Georgia"/>
+                <w:b w:val="0"/>
+                <w:i w:val="0"/>
+                <w:color w:val="6B7280"/>
+                <w:sz w:val="17"/>
+              </w:rPr>
+              <w:t>28</w:t>
+            </w:r>
+          </w:p>
+        </w:tc>
+      </w:tr>
+      <w:tr>
+        <w:tc>
+          <w:tcPr>
+            <w:tcW w:type="dxa" w:w="8460"/>
+          </w:tcPr>
+          <w:p>
+            <w:pPr>
+              <w:spacing w:after="0"/>
+              <w:jc w:val="left"/>
+            </w:pPr>
+            <w:r/>
+            <w:r>
+              <w:rPr>
+                <w:rFonts w:ascii="Georgia" w:hAnsi="Georgia"/>
+                <w:b w:val="0"/>
+                <w:i w:val="0"/>
+                <w:color w:val="262B35"/>
+                <w:sz w:val="17"/>
+              </w:rPr>
+              <w:t>Figure 9.  Valuation football field, 12-month view</w:t>
+            </w:r>
+          </w:p>
+        </w:tc>
+        <w:tc>
+          <w:tcPr>
+            <w:tcW w:type="dxa" w:w="900"/>
+          </w:tcPr>
+          <w:p>
+            <w:pPr>
+              <w:spacing w:after="0"/>
+              <w:jc w:val="right"/>
+            </w:pPr>
+            <w:r/>
+            <w:r>
+              <w:rPr>
+                <w:rFonts w:ascii="Georgia" w:hAnsi="Georgia"/>
+                <w:b w:val="0"/>
+                <w:i w:val="0"/>
+                <w:color w:val="6B7280"/>
+                <w:sz w:val="17"/>
+              </w:rPr>
+              <w:t>30</w:t>
+            </w:r>
+          </w:p>
+        </w:tc>
+      </w:tr>
+      <w:tr>
+        <w:tc>
+          <w:tcPr>
+            <w:tcW w:type="dxa" w:w="8460"/>
+          </w:tcPr>
+          <w:p>
+            <w:pPr>
+              <w:spacing w:after="0"/>
+              <w:jc w:val="left"/>
+            </w:pPr>
+            <w:r/>
+            <w:r>
+              <w:rPr>
+                <w:rFonts w:ascii="Georgia" w:hAnsi="Georgia"/>
+                <w:b w:val="0"/>
+                <w:i w:val="0"/>
+                <w:color w:val="262B35"/>
+                <w:sz w:val="17"/>
+              </w:rPr>
+              <w:t>Figure 10.  Sensitivity: run-rate by multiple</w:t>
+            </w:r>
+          </w:p>
+        </w:tc>
+        <w:tc>
+          <w:tcPr>
+            <w:tcW w:type="dxa" w:w="900"/>
+          </w:tcPr>
+          <w:p>
+            <w:pPr>
+              <w:spacing w:after="0"/>
+              <w:jc w:val="right"/>
+            </w:pPr>
+            <w:r/>
+            <w:r>
+              <w:rPr>
+                <w:rFonts w:ascii="Georgia" w:hAnsi="Georgia"/>
+                <w:b w:val="0"/>
+                <w:i w:val="0"/>
+                <w:color w:val="6B7280"/>
+                <w:sz w:val="17"/>
+              </w:rPr>
+              <w:t>31</w:t>
+            </w:r>
+          </w:p>
+        </w:tc>
+      </w:tr>
+    </w:tbl>
+    <w:p>
+      <w:pPr>
+        <w:pStyle w:val="Heading1"/>
+      </w:pPr>
+      <w:r>
         <w:t>Executive Summary and Investment Thesis</w:t>
       </w:r>
     </w:p>
@@ -1600,7 +2936,7 @@
           <w:color w:val="262B35"/>
           <w:sz w:val="21"/>
         </w:rPr>
-        <w:t>Quality that survives scrutiny. Growth above 80% at $6.9 billion scale is not a small-base artifact; it is the fastest growth of any software company near this size, against CrowdStrike at 26% and Shopify at 34% (T3: Tunguz, June 2026). The growth is accelerating: +50% in September 2025, +55% in December, +65% in February 2026, +80% in June (Figure 2). Margin, cash generation, and retention all clear institutional bars simultaneously, which is precisely what the AIBQ efficiency gate tests.</w:t>
+        <w:t>Quality that survives scrutiny. Growth above 80% at $6.9 billion scale is not a small-base artifact; it is the fastest growth of any software company near this size, against CrowdStrike at 26% and Shopify at 34% (T3: Tunguz, June 2026). The growth is accelerating: +50% in September 2025, +55% in December, +65% in February 2026, +80% in June (Figure 4). Margin, cash generation, and retention all clear institutional bars simultaneously, which is precisely what the AIBQ efficiency gate tests.</w:t>
       </w:r>
     </w:p>
     <w:p>
@@ -1628,7 +2964,7 @@
           <w:color w:val="262B35"/>
           <w:sz w:val="21"/>
         </w:rPr>
-        <w:t>The price. At $15.2 billion per AIBQ point, the market charges less for Databricks quality than for any other asset in the cohort (Figure 1). Growth-adjusted against its nearest public comp, the discount repeats: Databricks trades at 0.24x forward revenue multiple per point of growth versus Snowflake at 0.49x (Figure 3). Two independent yardsticks, private and public, say the same thing.</w:t>
+        <w:t>The price. At $15.2 billion per AIBQ point, the market charges less for Databricks quality than for any other asset in the cohort (Figure 1). Growth-adjusted against its nearest public comp, the discount repeats: Databricks trades at 0.24x forward revenue multiple per point of growth versus Snowflake at 0.49x (Figure 7). Two independent yardsticks, private and public, say the same thing.</w:t>
       </w:r>
     </w:p>
     <w:p>
@@ -3786,7 +5122,7 @@
           <w:color w:val="262B35"/>
           <w:sz w:val="21"/>
         </w:rPr>
-        <w:t>CI is the honest notch in the radar (Figure 4) and the dimension a skeptic should attack first. Databricks does not own hyperscale infrastructure; it rides AWS, Azure, and Google Cloud, pays their list economics, and competes with their first-party analytics services while depending on their capacity. Three mitigants keep the score at 8.0 rather than lower. First, multi-cloud is real at Databricks in a way it is not for most vendors: workloads are portable across all three hyperscalers, which converts suppliers into bidders. Second, the debt structure (roughly $9.3 billion across the January 2025 $5.25 billion facility, the January 2026 $1.8 billion addition, and the $2.0 billion Series L tranche) exists substantially to pre-fund compute commitments without burning equity, a deliberate hedge we credit here rather than in CE. Third, the MosaicML lineage gives Databricks genuine training and inference engineering of its own, so its AI unit economics are not purely a pass-through of someone else's GPU pricing. The offset is the new agentic cost curve: agents generating more queries is revenue, but at 74% and falling gross margin it is also the clearest evidence that compute cost is a live constraint.</w:t>
+        <w:t>CI is the honest notch in the radar (Figure 2) and the dimension a skeptic should attack first. Databricks does not own hyperscale infrastructure; it rides AWS, Azure, and Google Cloud, pays their list economics, and competes with their first-party analytics services while depending on their capacity. Three mitigants keep the score at 8.0 rather than lower. First, multi-cloud is real at Databricks in a way it is not for most vendors: workloads are portable across all three hyperscalers, which converts suppliers into bidders. Second, the debt structure (roughly $9.3 billion across the January 2025 $5.25 billion facility, the January 2026 $1.8 billion addition, and the $2.0 billion Series L tranche) exists substantially to pre-fund compute commitments without burning equity, a deliberate hedge we credit here rather than in CE. Third, the MosaicML lineage gives Databricks genuine training and inference engineering of its own, so its AI unit economics are not purely a pass-through of someone else's GPU pricing. The offset is the new agentic cost curve: agents generating more queries is revenue, but at 74% and falling gross margin it is also the clearest evidence that compute cost is a live constraint.</w:t>
       </w:r>
     </w:p>
     <w:p>
@@ -5281,7 +6617,7 @@
           <w:color w:val="262B35"/>
           <w:sz w:val="21"/>
         </w:rPr>
-        <w:t>Band placement: 8.81 sits in the Elite band (8.50 and above). Anthropic at 8.20 is Strong. OpenAI at 4.53 and xAI at 4.49 sit in the Developing band, scores dominated by revenue-quality and capital-efficiency deficits rather than by any doubt about their research. SSI at 2.30 is Distressed on business dimensions for the uncomplicated reason that it is pre-revenue by design. The per-point ladder in Figure 1 prices these scores; the peer radar in Figure 4 shapes them.</w:t>
+        <w:t>Band placement: 8.81 sits in the Elite band (8.50 and above). Anthropic at 8.20 is Strong. OpenAI at 4.53 and xAI at 4.49 sit in the Developing band, scores dominated by revenue-quality and capital-efficiency deficits rather than by any doubt about their research. SSI at 2.30 is Distressed on business dimensions for the uncomplicated reason that it is pre-revenue by design. The per-point ladder in Figure 1 prices these scores; the peer radar in Figure 2 shapes them.</w:t>
       </w:r>
     </w:p>
     <w:p>
@@ -5302,7 +6638,7 @@
               <a:graphicData uri="http://schemas.openxmlformats.org/drawingml/2006/picture">
                 <pic:pic>
                   <pic:nvPicPr>
-                    <pic:cNvPr id="0" name="fig04_radar.png"/>
+                    <pic:cNvPr id="0" name="fig02_radar.png"/>
                     <pic:cNvPicPr/>
                   </pic:nvPicPr>
                   <pic:blipFill>
@@ -5337,7 +6673,7 @@
           <w:color w:val="6B7280"/>
           <w:sz w:val="15"/>
         </w:rPr>
-        <w:t>Figure 4. AIBQ dimension scores, Databricks versus Frontier Five average, July 2026. Cohort dimension averages are desk estimates consistent with published composites (8.81 / 8.20 / 4.53 / 4.49 / 2.30). Source: desk AIBQ framework.</w:t>
+        <w:t>Figure 2. AIBQ dimension scores, Databricks versus Frontier Five average, July 2026. Cohort dimension averages are desk estimates consistent with published composites (8.81 / 8.20 / 4.53 / 4.49 / 2.30). Source: desk AIBQ framework.</w:t>
       </w:r>
     </w:p>
     <w:p>
@@ -5413,7 +6749,7 @@
           <w:color w:val="262B35"/>
           <w:sz w:val="21"/>
         </w:rPr>
-        <w:t>The product surface is best read as four strata, each deepening the dependency on the one below. The foundational layer creates the gravity; analytics monetizes it against the warehouse incumbents; the AI layer monetizes it against the model era; and the newest agentic and security surface aims to make the platform the operating substrate for autonomous software. Revenue attribution, where disclosed: AI products roughly $1.7 billion run-rate and Databricks SQL roughly $1.5 billion (both T2: June 16, 2026, CNBC and Bloomberg respectively), implying a residual core platform of roughly $3.7 billion. Figure 9 (Section 7) charts the mix.</w:t>
+        <w:t>The product surface is best read as four strata, each deepening the dependency on the one below. The foundational layer creates the gravity; analytics monetizes it against the warehouse incumbents; the AI layer monetizes it against the model era; and the newest agentic and security surface aims to make the platform the operating substrate for autonomous software. Revenue attribution, where disclosed: AI products roughly $1.7 billion run-rate and Databricks SQL roughly $1.5 billion (both T2: June 16, 2026, CNBC and Bloomberg respectively), implying a residual core platform of roughly $3.7 billion. Figure 3 (Section 7) charts the mix.</w:t>
       </w:r>
     </w:p>
     <w:p>
@@ -6011,7 +7347,7 @@
               <a:graphicData uri="http://schemas.openxmlformats.org/drawingml/2006/picture">
                 <pic:pic>
                   <pic:nvPicPr>
-                    <pic:cNvPr id="0" name="fig09_composition.png"/>
+                    <pic:cNvPr id="0" name="fig03_composition.png"/>
                     <pic:cNvPicPr/>
                   </pic:nvPicPr>
                   <pic:blipFill>
@@ -6046,7 +7382,7 @@
           <w:color w:val="6B7280"/>
           <w:sz w:val="15"/>
         </w:rPr>
-        <w:t>Figure 9. Revenue composition by product line, June 2026 disclosed versus June 2027 desk estimate. Sources: AI line $1.7B (T2: CNBC, Jun 16, 2026); DBSQL $1.5B (T2: Bloomberg, Jun 16, 2026); core is the residual; forward split is a desk estimate.</w:t>
+        <w:t>Figure 3. Revenue composition by product line, June 2026 disclosed versus June 2027 desk estimate. Sources: AI line $1.7B (T2: CNBC, Jun 16, 2026); DBSQL $1.5B (T2: Bloomberg, Jun 16, 2026); core is the residual; forward split is a desk estimate.</w:t>
       </w:r>
     </w:p>
     <w:p>
@@ -6077,7 +7413,7 @@
           <w:color w:val="262B35"/>
           <w:sz w:val="21"/>
         </w:rPr>
-        <w:t>Databricks disclosed a $6.9 billion annualized revenue run-rate growing more than 80% year over year on June 16, 2026 (T2: CNBC, from the Data + AI Summit analyst session). The level is remarkable; the second derivative is the thesis. Four consecutive public prints show growth accelerating at scale: $4.0 billion at +50% (September 2025), $4.8 billion at +55% (December 2025), $5.4 billion at +65% (February 9, 2026), $6.9 billion at +80% (June 2026), all company-announced (Figure 2). Software companies at multi-billion scale decelerate; this one added thirty points of growth rate in nine months while nearly doubling its base. The proximate drivers are attributable: the AI line compounding fastest, DBSQL doubling on workload switching, and consumption billing translating customer agent adoption directly into metered revenue.</w:t>
+        <w:t>Databricks disclosed a $6.9 billion annualized revenue run-rate growing more than 80% year over year on June 16, 2026 (T2: CNBC, from the Data + AI Summit analyst session). The level is remarkable; the second derivative is the thesis. Four consecutive public prints show growth accelerating at scale: $4.0 billion at +50% (September 2025), $4.8 billion at +55% (December 2025), $5.4 billion at +65% (February 9, 2026), $6.9 billion at +80% (June 2026), all company-announced (Figure 4). Software companies at multi-billion scale decelerate; this one added thirty points of growth rate in nine months while nearly doubling its base. The proximate drivers are attributable: the AI line compounding fastest, DBSQL doubling on workload switching, and consumption billing translating customer agent adoption directly into metered revenue.</w:t>
       </w:r>
     </w:p>
     <w:p>
@@ -6098,7 +7434,7 @@
               <a:graphicData uri="http://schemas.openxmlformats.org/drawingml/2006/picture">
                 <pic:pic>
                   <pic:nvPicPr>
-                    <pic:cNvPr id="0" name="fig02_acceleration.png"/>
+                    <pic:cNvPr id="0" name="fig04_acceleration.png"/>
                     <pic:cNvPicPr/>
                   </pic:nvPicPr>
                   <pic:blipFill>
@@ -6133,7 +7469,7 @@
           <w:color w:val="6B7280"/>
           <w:sz w:val="15"/>
         </w:rPr>
-        <w:t>Figure 2. Revenue run-rate and year-over-year growth, September 2025 to June 2026. Sources: company press releases (Sep 2025, Dec 2025, Feb 2026, T2) and CNBC from company disclosure (Jun 16, 2026, T2).</w:t>
+        <w:t>Figure 4. Revenue run-rate and year-over-year growth, September 2025 to June 2026. Sources: company press releases (Sep 2025, Dec 2025, Feb 2026, T2) and CNBC from company disclosure (Jun 16, 2026, T2).</w:t>
       </w:r>
     </w:p>
     <w:p>
@@ -8726,7 +10062,7 @@
           <w:color w:val="262B35"/>
           <w:sz w:val="21"/>
         </w:rPr>
-        <w:t>The Snowflake comparison is usually done lazily (two logos, one 'data war' headline) and the lazy version misses the finding. Done properly: Snowflake carries an enterprise value of roughly $89 billion (market capitalization ~$91 billion on July 7, 2026, less estimated net cash) against forward product-revenue guidance of $5.84 billion for FY2027, raised on May 27, 2026 from $5.66 billion, implying 31% growth (T1: 8-K; Q1 actuals ran ~30-34%). That is roughly 15.3x forward product revenue. Databricks at $134 billion against $6.9 billion is 19.4x, a higher headline multiple. But the buyer is not buying a multiple, the buyer is buying growth, and per point of growth purchased the ranking inverts: Databricks costs 0.24x per growth point, Snowflake 0.49x (Figure 3). Growth-adjusted, Databricks is roughly half the price of its own best public comparable. Meanwhile the operational scoreboard has already flipped: Databricks passed Snowflake in revenue during 2026, and the gap, roughly $490 million in March, was roughly $1.6 billion by June (T3: Tunguz, June 2026), with Databricks' warehousing product, Snowflake's home turf, doubling year over year to $1.5 billion (T2: Bloomberg, June 16, 2026).</w:t>
+        <w:t>The Snowflake comparison is usually done lazily (two logos, one 'data war' headline) and the lazy version misses the finding. Done properly: Snowflake carries an enterprise value of roughly $89 billion (market capitalization ~$91 billion on July 7, 2026, less estimated net cash) against forward product-revenue guidance of $5.84 billion for FY2027, raised on May 27, 2026 from $5.66 billion, implying 31% growth (T1: 8-K; Q1 actuals ran ~30-34%). That is roughly 15.3x forward product revenue. Databricks at $134 billion against $6.9 billion is 19.4x, a higher headline multiple. But the buyer is not buying a multiple, the buyer is buying growth, and per point of growth purchased the ranking inverts: Databricks costs 0.24x per growth point, Snowflake 0.49x (Figure 7). Growth-adjusted, Databricks is roughly half the price of its own best public comparable. Meanwhile the operational scoreboard has already flipped: Databricks passed Snowflake in revenue during 2026, and the gap, roughly $490 million in March, was roughly $1.6 billion by June (T3: Tunguz, June 2026), with Databricks' warehousing product, Snowflake's home turf, doubling year over year to $1.5 billion (T2: Bloomberg, June 16, 2026).</w:t>
       </w:r>
     </w:p>
     <w:p>
@@ -8747,7 +10083,7 @@
               <a:graphicData uri="http://schemas.openxmlformats.org/drawingml/2006/picture">
                 <pic:pic>
                   <pic:nvPicPr>
-                    <pic:cNvPr id="0" name="fig03_growth_adjusted.png"/>
+                    <pic:cNvPr id="0" name="fig07_growth_adjusted.png"/>
                     <pic:cNvPicPr/>
                   </pic:nvPicPr>
                   <pic:blipFill>
@@ -8782,7 +10118,7 @@
           <w:color w:val="6B7280"/>
           <w:sz w:val="15"/>
         </w:rPr>
-        <w:t>Figure 3. Growth-adjusted multiples: Databricks (19.4x / +80%) versus Snowflake (15.3x / +31% FY27 guide). Sources: Databricks per company disclosures (T2, Jun 16, 2026) and Feb 2026 mark; Snowflake per 8-K of May 27, 2026 (T1) and market data of Jul 7, 2026. Iso-value rays indicate equal price per growth point; no fitted line is shown.</w:t>
+        <w:t>Figure 7. Growth-adjusted multiples: Databricks (19.4x / +80%) versus Snowflake (15.3x / +31% FY27 guide). Sources: Databricks per company disclosures (T2, Jun 16, 2026) and Feb 2026 mark; Snowflake per 8-K of May 27, 2026 (T1) and market data of Jul 7, 2026. Iso-value rays indicate equal price per growth point; no fitted line is shown.</w:t>
       </w:r>
     </w:p>
     <w:p>
@@ -8934,7 +10270,7 @@
           <w:color w:val="262B35"/>
           <w:sz w:val="21"/>
         </w:rPr>
-        <w:t>Sequencing is the real risk, and 2026 has already run the experiment at both ends. The absorption wall (Figure 10): the AI mega-listing wave totals roughly $3.9 trillion of listing value against a US IPO market that absorbed only $44 to 47 billion of proceeds in all of 2025 (T2: Deloitte, EY). The first brick has cleared: SpaceX, carrying xAI after their February 2026 all-stock merger, listed in late June 2026 at a $1.77 trillion valuation and has rallied roughly 23% since (T3, July 2026), proof that the wall is scalable for a scarce, iconic asset. OpenAI and Anthropic have reportedly filed IPO paperwork (T3: Reuters/CNA syndication, June 9, 2026), targeting roughly $1 trillion and $965 billion respectively, with potential combined primary raises across the wave in the $240 billion range, more than five times a normal year's entire issuance. If those two price well, Databricks lists into a validated category with the cleanest financial profile of the wave and the smallest ask (it may need essentially no primary capital at all). If they price poorly or exhaust the demand pool, the window shuts into 2028, and Databricks' capacity to wait, uniquely in the cohort, is the hedge. Either way the labs go first and take the experiment risk; Databricks gets to price off their result. We would rather hold the asset that chooses than the assets that must.</w:t>
+        <w:t>Sequencing is the real risk, and 2026 has already run the experiment at both ends. The absorption wall (Figure 8): the AI mega-listing wave totals roughly $3.9 trillion of listing value against a US IPO market that absorbed only $44 to 47 billion of proceeds in all of 2025 (T2: Deloitte, EY). The first brick has cleared: SpaceX, carrying xAI after their February 2026 all-stock merger, listed in late June 2026 at a $1.77 trillion valuation and has rallied roughly 23% since (T3, July 2026), proof that the wall is scalable for a scarce, iconic asset. OpenAI and Anthropic have reportedly filed IPO paperwork (T3: Reuters/CNA syndication, June 9, 2026), targeting roughly $1 trillion and $965 billion respectively, with potential combined primary raises across the wave in the $240 billion range, more than five times a normal year's entire issuance. If those two price well, Databricks lists into a validated category with the cleanest financial profile of the wave and the smallest ask (it may need essentially no primary capital at all). If they price poorly or exhaust the demand pool, the window shuts into 2028, and Databricks' capacity to wait, uniquely in the cohort, is the hedge. Either way the labs go first and take the experiment risk; Databricks gets to price off their result. We would rather hold the asset that chooses than the assets that must.</w:t>
       </w:r>
     </w:p>
     <w:p>
@@ -8955,7 +10291,7 @@
               <a:graphicData uri="http://schemas.openxmlformats.org/drawingml/2006/picture">
                 <pic:pic>
                   <pic:nvPicPr>
-                    <pic:cNvPr id="0" name="fig10_absorption.png"/>
+                    <pic:cNvPr id="0" name="fig08_absorption.png"/>
                     <pic:cNvPicPr/>
                   </pic:nvPicPr>
                   <pic:blipFill>
@@ -8990,7 +10326,7 @@
           <w:color w:val="6B7280"/>
           <w:sz w:val="15"/>
         </w:rPr>
-        <w:t>Figure 10. The absorption question: AI mega-listing values versus 2025 US IPO issuance. Sources: SpaceX listing and performance (T3, Jun-Jul 2026); OpenAI target and Anthropic mark (T2/T3, Mar-May 2026); raise estimates (T3, desk aggregation); 2025 US IPO proceeds $44-47B (Deloitte, EY, T2).</w:t>
+        <w:t>Figure 8. The absorption question: AI mega-listing values versus 2025 US IPO issuance. Sources: SpaceX listing and performance (T3, Jun-Jul 2026); OpenAI target and Anthropic mark (T2/T3, Mar-May 2026); raise estimates (T3, desk aggregation); 2025 US IPO proceeds $44-47B (Deloitte, EY, T2).</w:t>
       </w:r>
     </w:p>
     <w:p>
@@ -9013,7 +10349,7 @@
           <w:color w:val="262B35"/>
           <w:sz w:val="21"/>
         </w:rPr>
-        <w:t>Three independent lenses, one discipline: the base case anchors on the completed $134 billion mark and lets disclosed growth do the work; the rumored round appears only as a reference line. First lens, quality-adjusted: at $15.2 billion per AIBQ point Databricks is the cheapest quality in the cohort by 7.8x against the nearest lab (Figure 1); this lens sets direction, not a target. Second lens, growth-adjusted comps: at 0.24x per growth point against Snowflake's 0.49x, parity pricing on Snowflake's growth-adjusted multiple would imply roughly $270 billion today; we treat that as an upper bound illustration, not a target, because a private mark should discount the public comp, not match it. Third lens, forward fundamentals, which is where the target lives: mid-2027 run-rate of roughly $11.5 billion (graceful deceleration from +80% to the mid-60s) at 14 to 16x run-rate, a deliberate de-rate from today's 19.4x toward what a public order book pays for hypergrowth data platforms, yields $161 to 184 billion; widening for execution variance gives the base corridor of $155 to 190 billion (Figures 7 and 8).</w:t>
+        <w:t>Three independent lenses, one discipline: the base case anchors on the completed $134 billion mark and lets disclosed growth do the work; the rumored round appears only as a reference line. First lens, quality-adjusted: at $15.2 billion per AIBQ point Databricks is the cheapest quality in the cohort by 7.8x against the nearest lab (Figure 1); this lens sets direction, not a target. Second lens, growth-adjusted comps: at 0.24x per growth point against Snowflake's 0.49x, parity pricing on Snowflake's growth-adjusted multiple would imply roughly $270 billion today; we treat that as an upper bound illustration, not a target, because a private mark should discount the public comp, not match it. Third lens, forward fundamentals, which is where the target lives: mid-2027 run-rate of roughly $11.5 billion (graceful deceleration from +80% to the mid-60s) at 14 to 16x run-rate, a deliberate de-rate from today's 19.4x toward what a public order book pays for hypergrowth data platforms, yields $161 to 184 billion; widening for execution variance gives the base corridor of $155 to 190 billion (Figures 9 and 10).</w:t>
       </w:r>
     </w:p>
     <w:p>
@@ -9565,7 +10901,7 @@
               <a:graphicData uri="http://schemas.openxmlformats.org/drawingml/2006/picture">
                 <pic:pic>
                   <pic:nvPicPr>
-                    <pic:cNvPr id="0" name="fig07_football_field.png"/>
+                    <pic:cNvPr id="0" name="fig09_football_field.png"/>
                     <pic:cNvPicPr/>
                   </pic:nvPicPr>
                   <pic:blipFill>
@@ -9600,7 +10936,7 @@
           <w:color w:val="6B7280"/>
           <w:sz w:val="15"/>
         </w:rPr>
-        <w:t>Figure 7. Valuation football field, 12-month view. The base case reaches the rumored range on fundamentals alone; the rumor is a reference line, not an input. Sources: as tabled above.</w:t>
+        <w:t>Figure 9. Valuation football field, 12-month view. The base case reaches the rumored range on fundamentals alone; the rumor is a reference line, not an input. Sources: as tabled above.</w:t>
       </w:r>
     </w:p>
     <w:p>
@@ -9615,7 +10951,7 @@
           <w:color w:val="262B35"/>
           <w:sz w:val="21"/>
         </w:rPr>
-        <w:t>The sensitivity grid (Figure 8) makes the machinery inspectable: value is forward run-rate times multiple, and the base intersection ($11.5 billion at 14 to 16x) sits comfortably above the current mark even after a five-point multiple de-rate. Read the bear column honestly: at $9.5 billion (growth halving) and 12x, the implied $114 billion sits 15% below the current mark, which is what the position risks if the margin gate breaks and growth decelerates simultaneously. Read the discipline the other way too: today's 19.4x on the base-case run-rate would imply roughly $223 billion, and we are deliberately not underwriting today's private multiple surviving the listing. The margin of safety is not the multiple; it is the per-point spread and the cohort-worst price for cohort-best quality.</w:t>
+        <w:t>The sensitivity grid (Figure 10) makes the machinery inspectable: value is forward run-rate times multiple, and the base intersection ($11.5 billion at 14 to 16x) sits comfortably above the current mark even after a five-point multiple de-rate. Read the bear column honestly: at $9.5 billion (growth halving) and 12x, the implied $114 billion sits 15% below the current mark, which is what the position risks if the margin gate breaks and growth decelerates simultaneously. Read the discipline the other way too: today's 19.4x on the base-case run-rate would imply roughly $223 billion, and we are deliberately not underwriting today's private multiple surviving the listing. The margin of safety is not the multiple; it is the per-point spread and the cohort-worst price for cohort-best quality.</w:t>
       </w:r>
     </w:p>
     <w:p>
@@ -9636,7 +10972,7 @@
               <a:graphicData uri="http://schemas.openxmlformats.org/drawingml/2006/picture">
                 <pic:pic>
                   <pic:nvPicPr>
-                    <pic:cNvPr id="0" name="fig08_sensitivity.png"/>
+                    <pic:cNvPr id="0" name="fig10_sensitivity.png"/>
                     <pic:cNvPicPr/>
                   </pic:nvPicPr>
                   <pic:blipFill>
@@ -9671,7 +11007,7 @@
           <w:color w:val="6B7280"/>
           <w:sz w:val="15"/>
         </w:rPr>
-        <w:t>Figure 8. Sensitivity: implied valuation across mid-2027E run-rate and multiple, base intersection highlighted. Desk estimates, July 10, 2026.</w:t>
+        <w:t>Figure 10. Sensitivity: implied valuation across mid-2027E run-rate and multiple, base intersection highlighted. Desk estimates, July 10, 2026.</w:t>
       </w:r>
     </w:p>
     <w:p>
@@ -10000,7 +11336,7 @@
                 <w:color w:val="262B35"/>
                 <w:sz w:val="16"/>
               </w:rPr>
-              <w:t>The thesis leans on acceleration at scale (Figure 2). A fall through ~50% while margin compresses converts the story to a peaked one; consumption billing cuts both ways in downturns (usage throttles without contract breach, as the 2022-23 cycle showed industry-wide).</w:t>
+              <w:t>The thesis leans on acceleration at scale (Figure 4). A fall through ~50% while margin compresses converts the story to a peaked one; consumption billing cuts both ways in downturns (usage throttles without contract breach, as the 2022-23 cycle showed industry-wide).</w:t>
             </w:r>
           </w:p>
         </w:tc>

</xml_diff>